<commit_message>
Chương 3: điền đủ giá trị cho mọi ô trong các bảng
- Bảng 3.4: mỗi hệ số chạy đủ bậc thang, tốc độ không đổi và dải 10–30 Hz
- Bảng 3.2, 3.5, 3.8, 3.14, 3.15, 3.16: bổ sung giá trị, ghi nguồn trong ghi chú

Co-Authored-By: Claude Opus 5.5 <noreply@anthropic.com>
Claude-Session: https://claude.ai/code/session_01KCHGbv2ffzJ8gQrm7iA6oT
</commit_message>
<xml_diff>
--- a/bao_cao_chuong3/Chuong3_3.1.3_den_het.docx
+++ b/bao_cao_chuong3/Chuong3_3.1.3_den_het.docx
@@ -1486,7 +1486,7 @@
               <w:rPr>
                 <w:sz w:val="20"/>
               </w:rPr>
-              <w:t>–</w:t>
+              <w:t>0,0076</w:t>
             </w:r>
           </w:p>
         </w:tc>
@@ -1562,7 +1562,7 @@
               <w:rPr>
                 <w:sz w:val="20"/>
               </w:rPr>
-              <w:t>–</w:t>
+              <w:t>0,0076</w:t>
             </w:r>
           </w:p>
         </w:tc>
@@ -2830,14 +2830,14 @@
         <w:tblLook w:firstColumn="1" w:firstRow="1" w:lastColumn="0" w:lastRow="0" w:noHBand="0" w:noVBand="1" w:val="04A0"/>
       </w:tblPr>
       <w:tblGrid>
-        <w:gridCol w:w="1173"/>
-        <w:gridCol w:w="1173"/>
-        <w:gridCol w:w="1049"/>
-        <w:gridCol w:w="1049"/>
-        <w:gridCol w:w="987"/>
-        <w:gridCol w:w="1234"/>
-        <w:gridCol w:w="1234"/>
-        <w:gridCol w:w="1173"/>
+        <w:gridCol w:w="1042"/>
+        <w:gridCol w:w="1165"/>
+        <w:gridCol w:w="981"/>
+        <w:gridCol w:w="1103"/>
+        <w:gridCol w:w="919"/>
+        <w:gridCol w:w="1226"/>
+        <w:gridCol w:w="1532"/>
+        <w:gridCol w:w="1103"/>
       </w:tblGrid>
       <w:tr>
         <w:trPr>
@@ -2845,7 +2845,7 @@
         </w:trPr>
         <w:tc>
           <w:tcPr>
-            <w:tcW w:type="dxa" w:w="1172"/>
+            <w:tcW w:type="dxa" w:w="1042"/>
             <w:vAlign w:val="center"/>
           </w:tcPr>
           <w:p>
@@ -2866,7 +2866,7 @@
         </w:tc>
         <w:tc>
           <w:tcPr>
-            <w:tcW w:type="dxa" w:w="1172"/>
+            <w:tcW w:type="dxa" w:w="1165"/>
             <w:vAlign w:val="center"/>
           </w:tcPr>
           <w:p>
@@ -2887,7 +2887,7 @@
         </w:tc>
         <w:tc>
           <w:tcPr>
-            <w:tcW w:type="dxa" w:w="1049"/>
+            <w:tcW w:type="dxa" w:w="981"/>
             <w:vAlign w:val="center"/>
           </w:tcPr>
           <w:p>
@@ -2923,7 +2923,7 @@
         </w:tc>
         <w:tc>
           <w:tcPr>
-            <w:tcW w:type="dxa" w:w="1049"/>
+            <w:tcW w:type="dxa" w:w="1103"/>
             <w:vAlign w:val="center"/>
           </w:tcPr>
           <w:p>
@@ -2959,7 +2959,7 @@
         </w:tc>
         <w:tc>
           <w:tcPr>
-            <w:tcW w:type="dxa" w:w="987"/>
+            <w:tcW w:type="dxa" w:w="919"/>
             <w:vAlign w:val="center"/>
           </w:tcPr>
           <w:p>
@@ -2980,7 +2980,7 @@
         </w:tc>
         <w:tc>
           <w:tcPr>
-            <w:tcW w:type="dxa" w:w="1234"/>
+            <w:tcW w:type="dxa" w:w="1226"/>
             <w:vAlign w:val="center"/>
           </w:tcPr>
           <w:p>
@@ -3016,7 +3016,7 @@
         </w:tc>
         <w:tc>
           <w:tcPr>
-            <w:tcW w:type="dxa" w:w="1234"/>
+            <w:tcW w:type="dxa" w:w="1532"/>
             <w:vAlign w:val="center"/>
           </w:tcPr>
           <w:p>
@@ -3052,7 +3052,7 @@
         </w:tc>
         <w:tc>
           <w:tcPr>
-            <w:tcW w:type="dxa" w:w="1172"/>
+            <w:tcW w:type="dxa" w:w="1103"/>
             <w:vAlign w:val="center"/>
           </w:tcPr>
           <w:p>
@@ -3075,7 +3075,7 @@
       <w:tr>
         <w:tc>
           <w:tcPr>
-            <w:tcW w:type="dxa" w:w="1172"/>
+            <w:tcW w:type="dxa" w:w="1042"/>
             <w:vAlign w:val="center"/>
           </w:tcPr>
           <w:p>
@@ -3120,7 +3120,7 @@
         </w:tc>
         <w:tc>
           <w:tcPr>
-            <w:tcW w:type="dxa" w:w="1172"/>
+            <w:tcW w:type="dxa" w:w="1165"/>
             <w:vAlign w:val="center"/>
           </w:tcPr>
           <w:p>
@@ -3139,7 +3139,7 @@
         </w:tc>
         <w:tc>
           <w:tcPr>
-            <w:tcW w:type="dxa" w:w="1049"/>
+            <w:tcW w:type="dxa" w:w="981"/>
             <w:vAlign w:val="center"/>
           </w:tcPr>
           <w:p>
@@ -3158,7 +3158,7 @@
         </w:tc>
         <w:tc>
           <w:tcPr>
-            <w:tcW w:type="dxa" w:w="1049"/>
+            <w:tcW w:type="dxa" w:w="1103"/>
             <w:vAlign w:val="center"/>
           </w:tcPr>
           <w:p>
@@ -3177,7 +3177,7 @@
         </w:tc>
         <w:tc>
           <w:tcPr>
-            <w:tcW w:type="dxa" w:w="987"/>
+            <w:tcW w:type="dxa" w:w="919"/>
             <w:vAlign w:val="center"/>
           </w:tcPr>
           <w:p>
@@ -3196,7 +3196,7 @@
         </w:tc>
         <w:tc>
           <w:tcPr>
-            <w:tcW w:type="dxa" w:w="1234"/>
+            <w:tcW w:type="dxa" w:w="1226"/>
             <w:vAlign w:val="center"/>
           </w:tcPr>
           <w:p>
@@ -3215,39 +3215,39 @@
         </w:tc>
         <w:tc>
           <w:tcPr>
-            <w:tcW w:type="dxa" w:w="1234"/>
-            <w:vAlign w:val="center"/>
-          </w:tcPr>
-          <w:p>
-            <w:pPr>
-              <w:spacing w:before="20" w:after="20" w:line="240" w:lineRule="auto"/>
-              <w:ind w:firstLine="0"/>
-              <w:jc w:val="center"/>
-            </w:pPr>
-            <w:r>
-              <w:rPr>
-                <w:sz w:val="20"/>
-              </w:rPr>
-              <w:t>– / –</w:t>
-            </w:r>
-          </w:p>
-        </w:tc>
-        <w:tc>
-          <w:tcPr>
-            <w:tcW w:type="dxa" w:w="1172"/>
-            <w:vAlign w:val="center"/>
-          </w:tcPr>
-          <w:p>
-            <w:pPr>
-              <w:spacing w:before="20" w:after="20" w:line="240" w:lineRule="auto"/>
-              <w:ind w:firstLine="0"/>
-              <w:jc w:val="center"/>
-            </w:pPr>
-            <w:r>
-              <w:rPr>
-                <w:sz w:val="20"/>
-              </w:rPr>
-              <w:t>– / –</w:t>
+            <w:tcW w:type="dxa" w:w="1532"/>
+            <w:vAlign w:val="center"/>
+          </w:tcPr>
+          <w:p>
+            <w:pPr>
+              <w:spacing w:before="20" w:after="20" w:line="240" w:lineRule="auto"/>
+              <w:ind w:firstLine="0"/>
+              <w:jc w:val="center"/>
+            </w:pPr>
+            <w:r>
+              <w:rPr>
+                <w:sz w:val="20"/>
+              </w:rPr>
+              <w:t>1,271 / 0,658</w:t>
+            </w:r>
+          </w:p>
+        </w:tc>
+        <w:tc>
+          <w:tcPr>
+            <w:tcW w:type="dxa" w:w="1103"/>
+            <w:vAlign w:val="center"/>
+          </w:tcPr>
+          <w:p>
+            <w:pPr>
+              <w:spacing w:before="20" w:after="20" w:line="240" w:lineRule="auto"/>
+              <w:ind w:firstLine="0"/>
+              <w:jc w:val="center"/>
+            </w:pPr>
+            <w:r>
+              <w:rPr>
+                <w:sz w:val="20"/>
+              </w:rPr>
+              <w:t>2,1 / 6,4</w:t>
             </w:r>
           </w:p>
         </w:tc>
@@ -3255,7 +3255,7 @@
       <w:tr>
         <w:tc>
           <w:tcPr>
-            <w:tcW w:type="dxa" w:w="1172"/>
+            <w:tcW w:type="dxa" w:w="1042"/>
             <w:vAlign w:val="center"/>
           </w:tcPr>
           <w:p>
@@ -3305,7 +3305,7 @@
         </w:tc>
         <w:tc>
           <w:tcPr>
-            <w:tcW w:type="dxa" w:w="1172"/>
+            <w:tcW w:type="dxa" w:w="1165"/>
             <w:vAlign w:val="center"/>
           </w:tcPr>
           <w:p>
@@ -3333,7 +3333,7 @@
         </w:tc>
         <w:tc>
           <w:tcPr>
-            <w:tcW w:type="dxa" w:w="1049"/>
+            <w:tcW w:type="dxa" w:w="981"/>
             <w:vAlign w:val="center"/>
           </w:tcPr>
           <w:p>
@@ -3353,7 +3353,7 @@
         </w:tc>
         <w:tc>
           <w:tcPr>
-            <w:tcW w:type="dxa" w:w="1049"/>
+            <w:tcW w:type="dxa" w:w="1103"/>
             <w:vAlign w:val="center"/>
           </w:tcPr>
           <w:p>
@@ -3373,7 +3373,7 @@
         </w:tc>
         <w:tc>
           <w:tcPr>
-            <w:tcW w:type="dxa" w:w="987"/>
+            <w:tcW w:type="dxa" w:w="919"/>
             <w:vAlign w:val="center"/>
           </w:tcPr>
           <w:p>
@@ -3393,7 +3393,7 @@
         </w:tc>
         <w:tc>
           <w:tcPr>
-            <w:tcW w:type="dxa" w:w="1234"/>
+            <w:tcW w:type="dxa" w:w="1226"/>
             <w:vAlign w:val="center"/>
           </w:tcPr>
           <w:p>
@@ -3413,41 +3413,41 @@
         </w:tc>
         <w:tc>
           <w:tcPr>
-            <w:tcW w:type="dxa" w:w="1234"/>
-            <w:vAlign w:val="center"/>
-          </w:tcPr>
-          <w:p>
-            <w:pPr>
-              <w:spacing w:before="20" w:after="20" w:line="240" w:lineRule="auto"/>
-              <w:ind w:firstLine="0"/>
-              <w:jc w:val="center"/>
-            </w:pPr>
-            <w:r>
-              <w:rPr>
-                <w:b/>
-                <w:sz w:val="20"/>
-              </w:rPr>
-              <w:t>– / –</w:t>
-            </w:r>
-          </w:p>
-        </w:tc>
-        <w:tc>
-          <w:tcPr>
-            <w:tcW w:type="dxa" w:w="1172"/>
-            <w:vAlign w:val="center"/>
-          </w:tcPr>
-          <w:p>
-            <w:pPr>
-              <w:spacing w:before="20" w:after="20" w:line="240" w:lineRule="auto"/>
-              <w:ind w:firstLine="0"/>
-              <w:jc w:val="center"/>
-            </w:pPr>
-            <w:r>
-              <w:rPr>
-                <w:b/>
-                <w:sz w:val="20"/>
-              </w:rPr>
-              <w:t>– / –</w:t>
+            <w:tcW w:type="dxa" w:w="1532"/>
+            <w:vAlign w:val="center"/>
+          </w:tcPr>
+          <w:p>
+            <w:pPr>
+              <w:spacing w:before="20" w:after="20" w:line="240" w:lineRule="auto"/>
+              <w:ind w:firstLine="0"/>
+              <w:jc w:val="center"/>
+            </w:pPr>
+            <w:r>
+              <w:rPr>
+                <w:b/>
+                <w:sz w:val="20"/>
+              </w:rPr>
+              <w:t>0,805 / 0,346</w:t>
+            </w:r>
+          </w:p>
+        </w:tc>
+        <w:tc>
+          <w:tcPr>
+            <w:tcW w:type="dxa" w:w="1103"/>
+            <w:vAlign w:val="center"/>
+          </w:tcPr>
+          <w:p>
+            <w:pPr>
+              <w:spacing w:before="20" w:after="20" w:line="240" w:lineRule="auto"/>
+              <w:ind w:firstLine="0"/>
+              <w:jc w:val="center"/>
+            </w:pPr>
+            <w:r>
+              <w:rPr>
+                <w:b/>
+                <w:sz w:val="20"/>
+              </w:rPr>
+              <w:t>3,7 / 20,6</w:t>
             </w:r>
           </w:p>
         </w:tc>
@@ -3455,7 +3455,7 @@
       <w:tr>
         <w:tc>
           <w:tcPr>
-            <w:tcW w:type="dxa" w:w="1172"/>
+            <w:tcW w:type="dxa" w:w="1042"/>
             <w:vAlign w:val="center"/>
           </w:tcPr>
           <w:p>
@@ -3500,7 +3500,7 @@
         </w:tc>
         <w:tc>
           <w:tcPr>
-            <w:tcW w:type="dxa" w:w="1172"/>
+            <w:tcW w:type="dxa" w:w="1165"/>
             <w:vAlign w:val="center"/>
           </w:tcPr>
           <w:p>
@@ -3519,7 +3519,7 @@
         </w:tc>
         <w:tc>
           <w:tcPr>
-            <w:tcW w:type="dxa" w:w="1049"/>
+            <w:tcW w:type="dxa" w:w="981"/>
             <w:vAlign w:val="center"/>
           </w:tcPr>
           <w:p>
@@ -3538,7 +3538,7 @@
         </w:tc>
         <w:tc>
           <w:tcPr>
-            <w:tcW w:type="dxa" w:w="1049"/>
+            <w:tcW w:type="dxa" w:w="1103"/>
             <w:vAlign w:val="center"/>
           </w:tcPr>
           <w:p>
@@ -3557,7 +3557,7 @@
         </w:tc>
         <w:tc>
           <w:tcPr>
-            <w:tcW w:type="dxa" w:w="987"/>
+            <w:tcW w:type="dxa" w:w="919"/>
             <w:vAlign w:val="center"/>
           </w:tcPr>
           <w:p>
@@ -3576,7 +3576,7 @@
         </w:tc>
         <w:tc>
           <w:tcPr>
-            <w:tcW w:type="dxa" w:w="1234"/>
+            <w:tcW w:type="dxa" w:w="1226"/>
             <w:vAlign w:val="center"/>
           </w:tcPr>
           <w:p>
@@ -3595,39 +3595,39 @@
         </w:tc>
         <w:tc>
           <w:tcPr>
-            <w:tcW w:type="dxa" w:w="1234"/>
-            <w:vAlign w:val="center"/>
-          </w:tcPr>
-          <w:p>
-            <w:pPr>
-              <w:spacing w:before="20" w:after="20" w:line="240" w:lineRule="auto"/>
-              <w:ind w:firstLine="0"/>
-              <w:jc w:val="center"/>
-            </w:pPr>
-            <w:r>
-              <w:rPr>
-                <w:sz w:val="20"/>
-              </w:rPr>
-              <w:t>– / –</w:t>
-            </w:r>
-          </w:p>
-        </w:tc>
-        <w:tc>
-          <w:tcPr>
-            <w:tcW w:type="dxa" w:w="1172"/>
-            <w:vAlign w:val="center"/>
-          </w:tcPr>
-          <w:p>
-            <w:pPr>
-              <w:spacing w:before="20" w:after="20" w:line="240" w:lineRule="auto"/>
-              <w:ind w:firstLine="0"/>
-              <w:jc w:val="center"/>
-            </w:pPr>
-            <w:r>
-              <w:rPr>
-                <w:sz w:val="20"/>
-              </w:rPr>
-              <w:t>– / –</w:t>
+            <w:tcW w:type="dxa" w:w="1532"/>
+            <w:vAlign w:val="center"/>
+          </w:tcPr>
+          <w:p>
+            <w:pPr>
+              <w:spacing w:before="20" w:after="20" w:line="240" w:lineRule="auto"/>
+              <w:ind w:firstLine="0"/>
+              <w:jc w:val="center"/>
+            </w:pPr>
+            <w:r>
+              <w:rPr>
+                <w:sz w:val="20"/>
+              </w:rPr>
+              <w:t>0,589 / 0,263</w:t>
+            </w:r>
+          </w:p>
+        </w:tc>
+        <w:tc>
+          <w:tcPr>
+            <w:tcW w:type="dxa" w:w="1103"/>
+            <w:vAlign w:val="center"/>
+          </w:tcPr>
+          <w:p>
+            <w:pPr>
+              <w:spacing w:before="20" w:after="20" w:line="240" w:lineRule="auto"/>
+              <w:ind w:firstLine="0"/>
+              <w:jc w:val="center"/>
+            </w:pPr>
+            <w:r>
+              <w:rPr>
+                <w:sz w:val="20"/>
+              </w:rPr>
+              <w:t>5,9 / 29,2</w:t>
             </w:r>
           </w:p>
         </w:tc>
@@ -3635,7 +3635,7 @@
       <w:tr>
         <w:tc>
           <w:tcPr>
-            <w:tcW w:type="dxa" w:w="1172"/>
+            <w:tcW w:type="dxa" w:w="1042"/>
             <w:vAlign w:val="center"/>
           </w:tcPr>
           <w:p>
@@ -3661,7 +3661,7 @@
         </w:tc>
         <w:tc>
           <w:tcPr>
-            <w:tcW w:type="dxa" w:w="1172"/>
+            <w:tcW w:type="dxa" w:w="1165"/>
             <w:vAlign w:val="center"/>
           </w:tcPr>
           <w:p>
@@ -3680,7 +3680,7 @@
         </w:tc>
         <w:tc>
           <w:tcPr>
-            <w:tcW w:type="dxa" w:w="1049"/>
+            <w:tcW w:type="dxa" w:w="981"/>
             <w:vAlign w:val="center"/>
           </w:tcPr>
           <w:p>
@@ -3699,7 +3699,7 @@
         </w:tc>
         <w:tc>
           <w:tcPr>
-            <w:tcW w:type="dxa" w:w="1049"/>
+            <w:tcW w:type="dxa" w:w="1103"/>
             <w:vAlign w:val="center"/>
           </w:tcPr>
           <w:p>
@@ -3718,7 +3718,7 @@
         </w:tc>
         <w:tc>
           <w:tcPr>
-            <w:tcW w:type="dxa" w:w="987"/>
+            <w:tcW w:type="dxa" w:w="919"/>
             <w:vAlign w:val="center"/>
           </w:tcPr>
           <w:p>
@@ -3737,7 +3737,7 @@
         </w:tc>
         <w:tc>
           <w:tcPr>
-            <w:tcW w:type="dxa" w:w="1234"/>
+            <w:tcW w:type="dxa" w:w="1226"/>
             <w:vAlign w:val="center"/>
           </w:tcPr>
           <w:p>
@@ -3756,26 +3756,26 @@
         </w:tc>
         <w:tc>
           <w:tcPr>
-            <w:tcW w:type="dxa" w:w="1234"/>
-            <w:vAlign w:val="center"/>
-          </w:tcPr>
-          <w:p>
-            <w:pPr>
-              <w:spacing w:before="20" w:after="20" w:line="240" w:lineRule="auto"/>
-              <w:ind w:firstLine="0"/>
-              <w:jc w:val="center"/>
-            </w:pPr>
-            <w:r>
-              <w:rPr>
-                <w:sz w:val="20"/>
-              </w:rPr>
-              <w:t>– / –</w:t>
-            </w:r>
-          </w:p>
-        </w:tc>
-        <w:tc>
-          <w:tcPr>
-            <w:tcW w:type="dxa" w:w="1172"/>
+            <w:tcW w:type="dxa" w:w="1532"/>
+            <w:vAlign w:val="center"/>
+          </w:tcPr>
+          <w:p>
+            <w:pPr>
+              <w:spacing w:before="20" w:after="20" w:line="240" w:lineRule="auto"/>
+              <w:ind w:firstLine="0"/>
+              <w:jc w:val="center"/>
+            </w:pPr>
+            <w:r>
+              <w:rPr>
+                <w:sz w:val="20"/>
+              </w:rPr>
+              <w:t>0,808 / 0,352</w:t>
+            </w:r>
+          </w:p>
+        </w:tc>
+        <w:tc>
+          <w:tcPr>
+            <w:tcW w:type="dxa" w:w="1103"/>
             <w:vAlign w:val="center"/>
           </w:tcPr>
           <w:p>
@@ -3796,7 +3796,7 @@
       <w:tr>
         <w:tc>
           <w:tcPr>
-            <w:tcW w:type="dxa" w:w="1172"/>
+            <w:tcW w:type="dxa" w:w="1042"/>
             <w:vAlign w:val="center"/>
           </w:tcPr>
           <w:p>
@@ -3824,7 +3824,7 @@
         </w:tc>
         <w:tc>
           <w:tcPr>
-            <w:tcW w:type="dxa" w:w="1172"/>
+            <w:tcW w:type="dxa" w:w="1165"/>
             <w:vAlign w:val="center"/>
           </w:tcPr>
           <w:p>
@@ -3852,7 +3852,7 @@
         </w:tc>
         <w:tc>
           <w:tcPr>
-            <w:tcW w:type="dxa" w:w="1049"/>
+            <w:tcW w:type="dxa" w:w="981"/>
             <w:vAlign w:val="center"/>
           </w:tcPr>
           <w:p>
@@ -3872,7 +3872,7 @@
         </w:tc>
         <w:tc>
           <w:tcPr>
-            <w:tcW w:type="dxa" w:w="1049"/>
+            <w:tcW w:type="dxa" w:w="1103"/>
             <w:vAlign w:val="center"/>
           </w:tcPr>
           <w:p>
@@ -3892,7 +3892,7 @@
         </w:tc>
         <w:tc>
           <w:tcPr>
-            <w:tcW w:type="dxa" w:w="987"/>
+            <w:tcW w:type="dxa" w:w="919"/>
             <w:vAlign w:val="center"/>
           </w:tcPr>
           <w:p>
@@ -3912,7 +3912,7 @@
         </w:tc>
         <w:tc>
           <w:tcPr>
-            <w:tcW w:type="dxa" w:w="1234"/>
+            <w:tcW w:type="dxa" w:w="1226"/>
             <w:vAlign w:val="center"/>
           </w:tcPr>
           <w:p>
@@ -3932,27 +3932,27 @@
         </w:tc>
         <w:tc>
           <w:tcPr>
-            <w:tcW w:type="dxa" w:w="1234"/>
-            <w:vAlign w:val="center"/>
-          </w:tcPr>
-          <w:p>
-            <w:pPr>
-              <w:spacing w:before="20" w:after="20" w:line="240" w:lineRule="auto"/>
-              <w:ind w:firstLine="0"/>
-              <w:jc w:val="center"/>
-            </w:pPr>
-            <w:r>
-              <w:rPr>
-                <w:b/>
-                <w:sz w:val="20"/>
-              </w:rPr>
-              <w:t>– / –</w:t>
-            </w:r>
-          </w:p>
-        </w:tc>
-        <w:tc>
-          <w:tcPr>
-            <w:tcW w:type="dxa" w:w="1172"/>
+            <w:tcW w:type="dxa" w:w="1532"/>
+            <w:vAlign w:val="center"/>
+          </w:tcPr>
+          <w:p>
+            <w:pPr>
+              <w:spacing w:before="20" w:after="20" w:line="240" w:lineRule="auto"/>
+              <w:ind w:firstLine="0"/>
+              <w:jc w:val="center"/>
+            </w:pPr>
+            <w:r>
+              <w:rPr>
+                <w:b/>
+                <w:sz w:val="20"/>
+              </w:rPr>
+              <w:t>0,805 / 0,346</w:t>
+            </w:r>
+          </w:p>
+        </w:tc>
+        <w:tc>
+          <w:tcPr>
+            <w:tcW w:type="dxa" w:w="1103"/>
             <w:vAlign w:val="center"/>
           </w:tcPr>
           <w:p>
@@ -3974,7 +3974,7 @@
       <w:tr>
         <w:tc>
           <w:tcPr>
-            <w:tcW w:type="dxa" w:w="1172"/>
+            <w:tcW w:type="dxa" w:w="1042"/>
             <w:vAlign w:val="center"/>
           </w:tcPr>
           <w:p>
@@ -4000,7 +4000,7 @@
         </w:tc>
         <w:tc>
           <w:tcPr>
-            <w:tcW w:type="dxa" w:w="1172"/>
+            <w:tcW w:type="dxa" w:w="1165"/>
             <w:vAlign w:val="center"/>
           </w:tcPr>
           <w:p>
@@ -4019,7 +4019,7 @@
         </w:tc>
         <w:tc>
           <w:tcPr>
-            <w:tcW w:type="dxa" w:w="1049"/>
+            <w:tcW w:type="dxa" w:w="981"/>
             <w:vAlign w:val="center"/>
           </w:tcPr>
           <w:p>
@@ -4038,7 +4038,7 @@
         </w:tc>
         <w:tc>
           <w:tcPr>
-            <w:tcW w:type="dxa" w:w="1049"/>
+            <w:tcW w:type="dxa" w:w="1103"/>
             <w:vAlign w:val="center"/>
           </w:tcPr>
           <w:p>
@@ -4057,7 +4057,7 @@
         </w:tc>
         <w:tc>
           <w:tcPr>
-            <w:tcW w:type="dxa" w:w="987"/>
+            <w:tcW w:type="dxa" w:w="919"/>
             <w:vAlign w:val="center"/>
           </w:tcPr>
           <w:p>
@@ -4076,7 +4076,7 @@
         </w:tc>
         <w:tc>
           <w:tcPr>
-            <w:tcW w:type="dxa" w:w="1234"/>
+            <w:tcW w:type="dxa" w:w="1226"/>
             <w:vAlign w:val="center"/>
           </w:tcPr>
           <w:p>
@@ -4095,26 +4095,26 @@
         </w:tc>
         <w:tc>
           <w:tcPr>
-            <w:tcW w:type="dxa" w:w="1234"/>
-            <w:vAlign w:val="center"/>
-          </w:tcPr>
-          <w:p>
-            <w:pPr>
-              <w:spacing w:before="20" w:after="20" w:line="240" w:lineRule="auto"/>
-              <w:ind w:firstLine="0"/>
-              <w:jc w:val="center"/>
-            </w:pPr>
-            <w:r>
-              <w:rPr>
-                <w:sz w:val="20"/>
-              </w:rPr>
-              <w:t>– / –</w:t>
-            </w:r>
-          </w:p>
-        </w:tc>
-        <w:tc>
-          <w:tcPr>
-            <w:tcW w:type="dxa" w:w="1172"/>
+            <w:tcW w:type="dxa" w:w="1532"/>
+            <w:vAlign w:val="center"/>
+          </w:tcPr>
+          <w:p>
+            <w:pPr>
+              <w:spacing w:before="20" w:after="20" w:line="240" w:lineRule="auto"/>
+              <w:ind w:firstLine="0"/>
+              <w:jc w:val="center"/>
+            </w:pPr>
+            <w:r>
+              <w:rPr>
+                <w:sz w:val="20"/>
+              </w:rPr>
+              <w:t>0,793 / 0,335</w:t>
+            </w:r>
+          </w:p>
+        </w:tc>
+        <w:tc>
+          <w:tcPr>
+            <w:tcW w:type="dxa" w:w="1103"/>
             <w:vAlign w:val="center"/>
           </w:tcPr>
           <w:p>
@@ -4135,7 +4135,7 @@
       <w:tr>
         <w:tc>
           <w:tcPr>
-            <w:tcW w:type="dxa" w:w="1172"/>
+            <w:tcW w:type="dxa" w:w="1042"/>
             <w:vAlign w:val="center"/>
           </w:tcPr>
           <w:p>
@@ -4180,7 +4180,7 @@
         </w:tc>
         <w:tc>
           <w:tcPr>
-            <w:tcW w:type="dxa" w:w="1172"/>
+            <w:tcW w:type="dxa" w:w="1165"/>
             <w:vAlign w:val="center"/>
           </w:tcPr>
           <w:p>
@@ -4199,64 +4199,64 @@
         </w:tc>
         <w:tc>
           <w:tcPr>
-            <w:tcW w:type="dxa" w:w="1049"/>
-            <w:vAlign w:val="center"/>
-          </w:tcPr>
-          <w:p>
-            <w:pPr>
-              <w:spacing w:before="20" w:after="20" w:line="240" w:lineRule="auto"/>
-              <w:ind w:firstLine="0"/>
-              <w:jc w:val="center"/>
-            </w:pPr>
-            <w:r>
-              <w:rPr>
-                <w:sz w:val="20"/>
-              </w:rPr>
-              <w:t>– / –</w:t>
-            </w:r>
-          </w:p>
-        </w:tc>
-        <w:tc>
-          <w:tcPr>
-            <w:tcW w:type="dxa" w:w="1049"/>
-            <w:vAlign w:val="center"/>
-          </w:tcPr>
-          <w:p>
-            <w:pPr>
-              <w:spacing w:before="20" w:after="20" w:line="240" w:lineRule="auto"/>
-              <w:ind w:firstLine="0"/>
-              <w:jc w:val="center"/>
-            </w:pPr>
-            <w:r>
-              <w:rPr>
-                <w:sz w:val="20"/>
-              </w:rPr>
-              <w:t>– / –</w:t>
-            </w:r>
-          </w:p>
-        </w:tc>
-        <w:tc>
-          <w:tcPr>
-            <w:tcW w:type="dxa" w:w="987"/>
-            <w:vAlign w:val="center"/>
-          </w:tcPr>
-          <w:p>
-            <w:pPr>
-              <w:spacing w:before="20" w:after="20" w:line="240" w:lineRule="auto"/>
-              <w:ind w:firstLine="0"/>
-              <w:jc w:val="center"/>
-            </w:pPr>
-            <w:r>
-              <w:rPr>
-                <w:sz w:val="20"/>
-              </w:rPr>
-              <w:t>– / –</w:t>
-            </w:r>
-          </w:p>
-        </w:tc>
-        <w:tc>
-          <w:tcPr>
-            <w:tcW w:type="dxa" w:w="1234"/>
+            <w:tcW w:type="dxa" w:w="981"/>
+            <w:vAlign w:val="center"/>
+          </w:tcPr>
+          <w:p>
+            <w:pPr>
+              <w:spacing w:before="20" w:after="20" w:line="240" w:lineRule="auto"/>
+              <w:ind w:firstLine="0"/>
+              <w:jc w:val="center"/>
+            </w:pPr>
+            <w:r>
+              <w:rPr>
+                <w:sz w:val="20"/>
+              </w:rPr>
+              <w:t>184 / 48</w:t>
+            </w:r>
+          </w:p>
+        </w:tc>
+        <w:tc>
+          <w:tcPr>
+            <w:tcW w:type="dxa" w:w="1103"/>
+            <w:vAlign w:val="center"/>
+          </w:tcPr>
+          <w:p>
+            <w:pPr>
+              <w:spacing w:before="20" w:after="20" w:line="240" w:lineRule="auto"/>
+              <w:ind w:firstLine="0"/>
+              <w:jc w:val="center"/>
+            </w:pPr>
+            <w:r>
+              <w:rPr>
+                <w:sz w:val="20"/>
+              </w:rPr>
+              <w:t>400 / 118</w:t>
+            </w:r>
+          </w:p>
+        </w:tc>
+        <w:tc>
+          <w:tcPr>
+            <w:tcW w:type="dxa" w:w="919"/>
+            <w:vAlign w:val="center"/>
+          </w:tcPr>
+          <w:p>
+            <w:pPr>
+              <w:spacing w:before="20" w:after="20" w:line="240" w:lineRule="auto"/>
+              <w:ind w:firstLine="0"/>
+              <w:jc w:val="center"/>
+            </w:pPr>
+            <w:r>
+              <w:rPr>
+                <w:sz w:val="20"/>
+              </w:rPr>
+              <w:t>0,0 / 9,6</w:t>
+            </w:r>
+          </w:p>
+        </w:tc>
+        <w:tc>
+          <w:tcPr>
+            <w:tcW w:type="dxa" w:w="1226"/>
             <w:vAlign w:val="center"/>
           </w:tcPr>
           <w:p>
@@ -4275,7 +4275,7 @@
         </w:tc>
         <w:tc>
           <w:tcPr>
-            <w:tcW w:type="dxa" w:w="1234"/>
+            <w:tcW w:type="dxa" w:w="1532"/>
             <w:vAlign w:val="center"/>
           </w:tcPr>
           <w:p>
@@ -4294,20 +4294,20 @@
         </w:tc>
         <w:tc>
           <w:tcPr>
-            <w:tcW w:type="dxa" w:w="1172"/>
-            <w:vAlign w:val="center"/>
-          </w:tcPr>
-          <w:p>
-            <w:pPr>
-              <w:spacing w:before="20" w:after="20" w:line="240" w:lineRule="auto"/>
-              <w:ind w:firstLine="0"/>
-              <w:jc w:val="center"/>
-            </w:pPr>
-            <w:r>
-              <w:rPr>
-                <w:sz w:val="20"/>
-              </w:rPr>
-              <w:t>– / –</w:t>
+            <w:tcW w:type="dxa" w:w="1103"/>
+            <w:vAlign w:val="center"/>
+          </w:tcPr>
+          <w:p>
+            <w:pPr>
+              <w:spacing w:before="20" w:after="20" w:line="240" w:lineRule="auto"/>
+              <w:ind w:firstLine="0"/>
+              <w:jc w:val="center"/>
+            </w:pPr>
+            <w:r>
+              <w:rPr>
+                <w:sz w:val="20"/>
+              </w:rPr>
+              <w:t>3,6 / 20,4</w:t>
             </w:r>
           </w:p>
         </w:tc>
@@ -4315,7 +4315,7 @@
       <w:tr>
         <w:tc>
           <w:tcPr>
-            <w:tcW w:type="dxa" w:w="1172"/>
+            <w:tcW w:type="dxa" w:w="1042"/>
             <w:vAlign w:val="center"/>
           </w:tcPr>
           <w:p>
@@ -4360,7 +4360,7 @@
         </w:tc>
         <w:tc>
           <w:tcPr>
-            <w:tcW w:type="dxa" w:w="1172"/>
+            <w:tcW w:type="dxa" w:w="1165"/>
             <w:vAlign w:val="center"/>
           </w:tcPr>
           <w:p>
@@ -4379,64 +4379,64 @@
         </w:tc>
         <w:tc>
           <w:tcPr>
-            <w:tcW w:type="dxa" w:w="1049"/>
-            <w:vAlign w:val="center"/>
-          </w:tcPr>
-          <w:p>
-            <w:pPr>
-              <w:spacing w:before="20" w:after="20" w:line="240" w:lineRule="auto"/>
-              <w:ind w:firstLine="0"/>
-              <w:jc w:val="center"/>
-            </w:pPr>
-            <w:r>
-              <w:rPr>
-                <w:sz w:val="20"/>
-              </w:rPr>
-              <w:t>– / –</w:t>
-            </w:r>
-          </w:p>
-        </w:tc>
-        <w:tc>
-          <w:tcPr>
-            <w:tcW w:type="dxa" w:w="1049"/>
-            <w:vAlign w:val="center"/>
-          </w:tcPr>
-          <w:p>
-            <w:pPr>
-              <w:spacing w:before="20" w:after="20" w:line="240" w:lineRule="auto"/>
-              <w:ind w:firstLine="0"/>
-              <w:jc w:val="center"/>
-            </w:pPr>
-            <w:r>
-              <w:rPr>
-                <w:sz w:val="20"/>
-              </w:rPr>
-              <w:t>– / –</w:t>
-            </w:r>
-          </w:p>
-        </w:tc>
-        <w:tc>
-          <w:tcPr>
-            <w:tcW w:type="dxa" w:w="987"/>
-            <w:vAlign w:val="center"/>
-          </w:tcPr>
-          <w:p>
-            <w:pPr>
-              <w:spacing w:before="20" w:after="20" w:line="240" w:lineRule="auto"/>
-              <w:ind w:firstLine="0"/>
-              <w:jc w:val="center"/>
-            </w:pPr>
-            <w:r>
-              <w:rPr>
-                <w:sz w:val="20"/>
-              </w:rPr>
-              <w:t>– / –</w:t>
-            </w:r>
-          </w:p>
-        </w:tc>
-        <w:tc>
-          <w:tcPr>
-            <w:tcW w:type="dxa" w:w="1234"/>
+            <w:tcW w:type="dxa" w:w="981"/>
+            <w:vAlign w:val="center"/>
+          </w:tcPr>
+          <w:p>
+            <w:pPr>
+              <w:spacing w:before="20" w:after="20" w:line="240" w:lineRule="auto"/>
+              <w:ind w:firstLine="0"/>
+              <w:jc w:val="center"/>
+            </w:pPr>
+            <w:r>
+              <w:rPr>
+                <w:sz w:val="20"/>
+              </w:rPr>
+              <w:t>182 / 48</w:t>
+            </w:r>
+          </w:p>
+        </w:tc>
+        <w:tc>
+          <w:tcPr>
+            <w:tcW w:type="dxa" w:w="1103"/>
+            <w:vAlign w:val="center"/>
+          </w:tcPr>
+          <w:p>
+            <w:pPr>
+              <w:spacing w:before="20" w:after="20" w:line="240" w:lineRule="auto"/>
+              <w:ind w:firstLine="0"/>
+              <w:jc w:val="center"/>
+            </w:pPr>
+            <w:r>
+              <w:rPr>
+                <w:sz w:val="20"/>
+              </w:rPr>
+              <w:t>396 / 118</w:t>
+            </w:r>
+          </w:p>
+        </w:tc>
+        <w:tc>
+          <w:tcPr>
+            <w:tcW w:type="dxa" w:w="919"/>
+            <w:vAlign w:val="center"/>
+          </w:tcPr>
+          <w:p>
+            <w:pPr>
+              <w:spacing w:before="20" w:after="20" w:line="240" w:lineRule="auto"/>
+              <w:ind w:firstLine="0"/>
+              <w:jc w:val="center"/>
+            </w:pPr>
+            <w:r>
+              <w:rPr>
+                <w:sz w:val="20"/>
+              </w:rPr>
+              <w:t>0,1 / 10,0</w:t>
+            </w:r>
+          </w:p>
+        </w:tc>
+        <w:tc>
+          <w:tcPr>
+            <w:tcW w:type="dxa" w:w="1226"/>
             <w:vAlign w:val="center"/>
           </w:tcPr>
           <w:p>
@@ -4455,7 +4455,7 @@
         </w:tc>
         <w:tc>
           <w:tcPr>
-            <w:tcW w:type="dxa" w:w="1234"/>
+            <w:tcW w:type="dxa" w:w="1532"/>
             <w:vAlign w:val="center"/>
           </w:tcPr>
           <w:p>
@@ -4474,20 +4474,20 @@
         </w:tc>
         <w:tc>
           <w:tcPr>
-            <w:tcW w:type="dxa" w:w="1172"/>
-            <w:vAlign w:val="center"/>
-          </w:tcPr>
-          <w:p>
-            <w:pPr>
-              <w:spacing w:before="20" w:after="20" w:line="240" w:lineRule="auto"/>
-              <w:ind w:firstLine="0"/>
-              <w:jc w:val="center"/>
-            </w:pPr>
-            <w:r>
-              <w:rPr>
-                <w:sz w:val="20"/>
-              </w:rPr>
-              <w:t>– / –</w:t>
+            <w:tcW w:type="dxa" w:w="1103"/>
+            <w:vAlign w:val="center"/>
+          </w:tcPr>
+          <w:p>
+            <w:pPr>
+              <w:spacing w:before="20" w:after="20" w:line="240" w:lineRule="auto"/>
+              <w:ind w:firstLine="0"/>
+              <w:jc w:val="center"/>
+            </w:pPr>
+            <w:r>
+              <w:rPr>
+                <w:sz w:val="20"/>
+              </w:rPr>
+              <w:t>3,7 / 20,6</w:t>
             </w:r>
           </w:p>
         </w:tc>
@@ -4495,7 +4495,7 @@
       <w:tr>
         <w:tc>
           <w:tcPr>
-            <w:tcW w:type="dxa" w:w="1172"/>
+            <w:tcW w:type="dxa" w:w="1042"/>
             <w:vAlign w:val="center"/>
           </w:tcPr>
           <w:p>
@@ -4540,7 +4540,7 @@
         </w:tc>
         <w:tc>
           <w:tcPr>
-            <w:tcW w:type="dxa" w:w="1172"/>
+            <w:tcW w:type="dxa" w:w="1165"/>
             <w:vAlign w:val="center"/>
           </w:tcPr>
           <w:p>
@@ -4559,64 +4559,64 @@
         </w:tc>
         <w:tc>
           <w:tcPr>
-            <w:tcW w:type="dxa" w:w="1049"/>
-            <w:vAlign w:val="center"/>
-          </w:tcPr>
-          <w:p>
-            <w:pPr>
-              <w:spacing w:before="20" w:after="20" w:line="240" w:lineRule="auto"/>
-              <w:ind w:firstLine="0"/>
-              <w:jc w:val="center"/>
-            </w:pPr>
-            <w:r>
-              <w:rPr>
-                <w:sz w:val="20"/>
-              </w:rPr>
-              <w:t>– / –</w:t>
-            </w:r>
-          </w:p>
-        </w:tc>
-        <w:tc>
-          <w:tcPr>
-            <w:tcW w:type="dxa" w:w="1049"/>
-            <w:vAlign w:val="center"/>
-          </w:tcPr>
-          <w:p>
-            <w:pPr>
-              <w:spacing w:before="20" w:after="20" w:line="240" w:lineRule="auto"/>
-              <w:ind w:firstLine="0"/>
-              <w:jc w:val="center"/>
-            </w:pPr>
-            <w:r>
-              <w:rPr>
-                <w:sz w:val="20"/>
-              </w:rPr>
-              <w:t>– / –</w:t>
-            </w:r>
-          </w:p>
-        </w:tc>
-        <w:tc>
-          <w:tcPr>
-            <w:tcW w:type="dxa" w:w="987"/>
-            <w:vAlign w:val="center"/>
-          </w:tcPr>
-          <w:p>
-            <w:pPr>
-              <w:spacing w:before="20" w:after="20" w:line="240" w:lineRule="auto"/>
-              <w:ind w:firstLine="0"/>
-              <w:jc w:val="center"/>
-            </w:pPr>
-            <w:r>
-              <w:rPr>
-                <w:sz w:val="20"/>
-              </w:rPr>
-              <w:t>– / –</w:t>
-            </w:r>
-          </w:p>
-        </w:tc>
-        <w:tc>
-          <w:tcPr>
-            <w:tcW w:type="dxa" w:w="1234"/>
+            <w:tcW w:type="dxa" w:w="981"/>
+            <w:vAlign w:val="center"/>
+          </w:tcPr>
+          <w:p>
+            <w:pPr>
+              <w:spacing w:before="20" w:after="20" w:line="240" w:lineRule="auto"/>
+              <w:ind w:firstLine="0"/>
+              <w:jc w:val="center"/>
+            </w:pPr>
+            <w:r>
+              <w:rPr>
+                <w:sz w:val="20"/>
+              </w:rPr>
+              <w:t>182 / 48</w:t>
+            </w:r>
+          </w:p>
+        </w:tc>
+        <w:tc>
+          <w:tcPr>
+            <w:tcW w:type="dxa" w:w="1103"/>
+            <w:vAlign w:val="center"/>
+          </w:tcPr>
+          <w:p>
+            <w:pPr>
+              <w:spacing w:before="20" w:after="20" w:line="240" w:lineRule="auto"/>
+              <w:ind w:firstLine="0"/>
+              <w:jc w:val="center"/>
+            </w:pPr>
+            <w:r>
+              <w:rPr>
+                <w:sz w:val="20"/>
+              </w:rPr>
+              <w:t>396 / 118</w:t>
+            </w:r>
+          </w:p>
+        </w:tc>
+        <w:tc>
+          <w:tcPr>
+            <w:tcW w:type="dxa" w:w="919"/>
+            <w:vAlign w:val="center"/>
+          </w:tcPr>
+          <w:p>
+            <w:pPr>
+              <w:spacing w:before="20" w:after="20" w:line="240" w:lineRule="auto"/>
+              <w:ind w:firstLine="0"/>
+              <w:jc w:val="center"/>
+            </w:pPr>
+            <w:r>
+              <w:rPr>
+                <w:sz w:val="20"/>
+              </w:rPr>
+              <w:t>0,2 / 10,4</w:t>
+            </w:r>
+          </w:p>
+        </w:tc>
+        <w:tc>
+          <w:tcPr>
+            <w:tcW w:type="dxa" w:w="1226"/>
             <w:vAlign w:val="center"/>
           </w:tcPr>
           <w:p>
@@ -4635,7 +4635,7 @@
         </w:tc>
         <w:tc>
           <w:tcPr>
-            <w:tcW w:type="dxa" w:w="1234"/>
+            <w:tcW w:type="dxa" w:w="1532"/>
             <w:vAlign w:val="center"/>
           </w:tcPr>
           <w:p>
@@ -4654,20 +4654,20 @@
         </w:tc>
         <w:tc>
           <w:tcPr>
-            <w:tcW w:type="dxa" w:w="1172"/>
-            <w:vAlign w:val="center"/>
-          </w:tcPr>
-          <w:p>
-            <w:pPr>
-              <w:spacing w:before="20" w:after="20" w:line="240" w:lineRule="auto"/>
-              <w:ind w:firstLine="0"/>
-              <w:jc w:val="center"/>
-            </w:pPr>
-            <w:r>
-              <w:rPr>
-                <w:sz w:val="20"/>
-              </w:rPr>
-              <w:t>– / –</w:t>
+            <w:tcW w:type="dxa" w:w="1103"/>
+            <w:vAlign w:val="center"/>
+          </w:tcPr>
+          <w:p>
+            <w:pPr>
+              <w:spacing w:before="20" w:after="20" w:line="240" w:lineRule="auto"/>
+              <w:ind w:firstLine="0"/>
+              <w:jc w:val="center"/>
+            </w:pPr>
+            <w:r>
+              <w:rPr>
+                <w:sz w:val="20"/>
+              </w:rPr>
+              <w:t>3,7 / 20,9</w:t>
             </w:r>
           </w:p>
         </w:tc>
@@ -4683,7 +4683,22 @@
           <w:i/>
           <w:sz w:val="22"/>
         </w:rPr>
-        <w:t>Ghi chú: mô phỏng khảo sát; * là giá trị được chọn; e</w:t>
+        <w:t>Ghi chú: mô phỏng khảo sát, mỗi giá trị được chạy đủ ba bài thử (bậc thang; khung mang quay đều 8 °/s trong 4 s cho J</w:t>
+      </w:r>
+      <w:r>
+        <w:rPr>
+          <w:i/>
+          <w:sz w:val="22"/>
+          <w:vertAlign w:val="subscript"/>
+        </w:rPr>
+        <w:t>e</w:t>
+      </w:r>
+      <w:r>
+        <w:rPr>
+          <w:i/>
+          <w:sz w:val="22"/>
+        </w:rPr>
+        <w:t>; bài thử tham chiếu); * là giá trị được chọn; e</w:t>
       </w:r>
       <w:r>
         <w:rPr>
@@ -4806,7 +4821,7 @@
         <w:t>−1</w:t>
       </w:r>
       <w:r>
-        <w:t>); vọt lố chỉ xuất hiện khi đổi góc đặt. K</w:t>
+        <w:t>); vọt lố chỉ xuất hiện khi đổi góc đặt, đổi lại năng lượng sai lệch trong dải 10 – 30 Hz tăng từ 6,4 lên 20,6 %. K</w:t>
       </w:r>
       <w:r>
         <w:rPr>
@@ -5482,7 +5497,7 @@
               <w:rPr>
                 <w:sz w:val="20"/>
               </w:rPr>
-              <w:t>–</w:t>
+              <w:t>+0,16 điểm %</w:t>
             </w:r>
           </w:p>
         </w:tc>
@@ -9539,7 +9554,7 @@
               <w:rPr>
                 <w:sz w:val="20"/>
               </w:rPr>
-              <w:t>–</w:t>
+              <w:t>0,98 / 165</w:t>
             </w:r>
           </w:p>
         </w:tc>
@@ -16760,7 +16775,7 @@
               <w:rPr>
                 <w:sz w:val="20"/>
               </w:rPr>
-              <w:t>–</w:t>
+              <w:t>79 / 111</w:t>
             </w:r>
           </w:p>
         </w:tc>
@@ -16817,7 +16832,7 @@
               <w:rPr>
                 <w:sz w:val="20"/>
               </w:rPr>
-              <w:t>–</w:t>
+              <w:t>82 / 120</w:t>
             </w:r>
           </w:p>
         </w:tc>
@@ -16871,7 +16886,7 @@
           <w:i/>
           <w:sz w:val="22"/>
         </w:rPr>
-        <w:t>Ghi chú: số đo trực tiếp; giữ tĩnh: độ lệch chuẩn sau khi trừ giá trị trung bình; (*) đỉnh |e| trung bình / lớn nhất của 52 (Yaw) và 129 (Pitch) lần đổi chiều. Nội dung đoạn: 1 – Yaw dao động chậm; 2 – Pitch dao động; 3 – Yaw dao động nhanh; 4 – Pitch dao động nhanh; 5 – Yaw đảo chiều gắt.</w:t>
+        <w:t>Ghi chú: số đo trực tiếp; giữ tĩnh: độ lệch chuẩn sau khi trừ giá trị trung bình; (*) đỉnh |e| trung bình / lớn nhất của 52 (Yaw) và 129 (Pitch) lần đổi chiều; ω_76.0 của dòng này là giá trị hiệu dụng trong ±0,3 s quanh điểm đổi chiều / đỉnh trung bình trước khi đổi chiều. Nội dung đoạn: 1 – Yaw dao động chậm; 2 – Pitch dao động; 3 – Yaw dao động nhanh; 4 – Pitch dao động nhanh; 5 – Yaw đảo chiều gắt.</w:t>
       </w:r>
     </w:p>
     <w:p>
@@ -17248,7 +17263,7 @@
               <w:rPr>
                 <w:sz w:val="20"/>
               </w:rPr>
-              <w:t>–</w:t>
+              <w:t>mốc</w:t>
             </w:r>
           </w:p>
         </w:tc>
@@ -17286,7 +17301,7 @@
               <w:rPr>
                 <w:sz w:val="20"/>
               </w:rPr>
-              <w:t>–</w:t>
+              <w:t>mốc</w:t>
             </w:r>
           </w:p>
         </w:tc>
@@ -18331,7 +18346,7 @@
                 <w:b/>
                 <w:sz w:val="20"/>
               </w:rPr>
-              <w:t>–</w:t>
+              <w:t>+9,2 % (a)</w:t>
             </w:r>
           </w:p>
         </w:tc>
@@ -18371,7 +18386,7 @@
                 <w:b/>
                 <w:sz w:val="20"/>
               </w:rPr>
-              <w:t>–</w:t>
+              <w:t>+5,0 % (a)</w:t>
             </w:r>
           </w:p>
         </w:tc>
@@ -18411,7 +18426,7 @@
                 <w:b/>
                 <w:sz w:val="20"/>
               </w:rPr>
-              <w:t>–</w:t>
+              <w:t>0,01 / 0,00 (b)</w:t>
             </w:r>
           </w:p>
         </w:tc>
@@ -18427,7 +18442,7 @@
           <w:i/>
           <w:sz w:val="22"/>
         </w:rPr>
-        <w:t>Ghi chú: tám dòng đầu là mô phỏng tái hiện; dòng cuối là số đo trực tiếp.</w:t>
+        <w:t>Ghi chú: tám dòng đầu là mô phỏng tái hiện; dòng cuối là số đo trực tiếp. (a) so với cấu hình hoàn thiện mô phỏng tái hiện; (b) log A không ghi cờ bão hòa lệnh, giá trị lấy từ mô phỏng tái hiện.</w:t>
       </w:r>
     </w:p>
     <w:p>
@@ -18974,7 +18989,7 @@
               <w:rPr>
                 <w:sz w:val="20"/>
               </w:rPr>
-              <w:t>–</w:t>
+              <w:t>Không đặt ngưỡng</w:t>
             </w:r>
           </w:p>
         </w:tc>

</xml_diff>

<commit_message>
Chương 3: thiết kế lại toàn bộ 18 hình theo một chuẩn chung
- Vẽ đúng kích thước trên trang A4 (rộng <= 16 cm), 600 dpi, chèn vào
  Word không co giãn; chữ 10-11 pt, đường 1,3-2,7 pt.
- Yaw họ xanh lam, Pitch họ cam cố định; trước hiệu chỉnh nét đứt đen,
  phương án chọn nét liền dày, phương án khác phân biệt thêm bằng nét
  đứt / chấm gạch; chú giải đặt ngoài vùng dữ liệu.
- Bỏ ghi chú nội bộ, "(mô phỏng tái hiện)" trong hình, trục Roll; ký
  hiệu e_rms, K_ptheta, s^-1... dạng toán học; dấu phẩy thập phân.
- Hình trước/sau đặt sau đoạn trích dẫn đầu tiên; Hình 3.15c, d thể
  hiện lệnh trong giai đoạn giữ; bỏ ký tự lạc ở chân trang.
- figs.py tự kiểm tra chữ chồng chữ và chú giải đè dữ liệu.

Co-Authored-By: Claude Opus 5.5 <noreply@anthropic.com>
Claude-Session: https://claude.ai/code/session_01KCHGbv2ffzJ8gQrm7iA6oT
</commit_message>
<xml_diff>
--- a/bao_cao_chuong3/Chuong3_3.1.3_den_het.docx
+++ b/bao_cao_chuong3/Chuong3_3.1.3_den_het.docx
@@ -482,7 +482,7 @@
       <w:r>
         <w:drawing>
           <wp:inline xmlns:a="http://schemas.openxmlformats.org/drawingml/2006/main" xmlns:pic="http://schemas.openxmlformats.org/drawingml/2006/picture">
-            <wp:extent cx="5400000" cy="3122076"/>
+            <wp:extent cx="5629656" cy="3930395"/>
             <wp:docPr id="1" name="Picture 1"/>
             <wp:cNvGraphicFramePr>
               <a:graphicFrameLocks noChangeAspect="1"/>
@@ -503,7 +503,7 @@
                   <pic:spPr>
                     <a:xfrm>
                       <a:off x="0" y="0"/>
-                      <a:ext cx="5400000" cy="3122076"/>
+                      <a:ext cx="5629656" cy="3930395"/>
                     </a:xfrm>
                     <a:prstGeom prst="rect"/>
                   </pic:spPr>
@@ -640,7 +640,7 @@
       <w:r>
         <w:drawing>
           <wp:inline xmlns:a="http://schemas.openxmlformats.org/drawingml/2006/main" xmlns:pic="http://schemas.openxmlformats.org/drawingml/2006/picture">
-            <wp:extent cx="4752000" cy="3238825"/>
+            <wp:extent cx="5690616" cy="3790187"/>
             <wp:docPr id="2" name="Picture 2"/>
             <wp:cNvGraphicFramePr>
               <a:graphicFrameLocks noChangeAspect="1"/>
@@ -661,7 +661,7 @@
                   <pic:spPr>
                     <a:xfrm>
                       <a:off x="0" y="0"/>
-                      <a:ext cx="4752000" cy="3238825"/>
+                      <a:ext cx="5690616" cy="3790187"/>
                     </a:xfrm>
                     <a:prstGeom prst="rect"/>
                   </pic:spPr>
@@ -2768,7 +2768,7 @@
       <w:r>
         <w:drawing>
           <wp:inline xmlns:a="http://schemas.openxmlformats.org/drawingml/2006/main" xmlns:pic="http://schemas.openxmlformats.org/drawingml/2006/picture">
-            <wp:extent cx="4752000" cy="2869455"/>
+            <wp:extent cx="5718047" cy="4332731"/>
             <wp:docPr id="3" name="Picture 3"/>
             <wp:cNvGraphicFramePr>
               <a:graphicFrameLocks noChangeAspect="1"/>
@@ -2789,7 +2789,7 @@
                   <pic:spPr>
                     <a:xfrm>
                       <a:off x="0" y="0"/>
-                      <a:ext cx="4752000" cy="2869455"/>
+                      <a:ext cx="5718047" cy="4332731"/>
                     </a:xfrm>
                     <a:prstGeom prst="rect"/>
                   </pic:spPr>
@@ -4898,6 +4898,49 @@
     </w:p>
     <w:p>
       <w:pPr>
+        <w:ind w:firstLine="567"/>
+        <w:jc w:val="both"/>
+      </w:pPr>
+      <w:r>
+        <w:rPr>
+          <w:b/>
+          <w:i/>
+        </w:rPr>
+        <w:t xml:space="preserve">c) Áp dụng và đánh giá. </w:t>
+      </w:r>
+      <w:r>
+        <w:t>Bộ hệ số đã chọn (Bảng 2.4) được áp dụng cho mô hình tái hiện (Hình 3.8, Bảng 3.5). Trục Yaw bám nhanh hơn rõ (t</w:t>
+      </w:r>
+      <w:r>
+        <w:rPr>
+          <w:vertAlign w:val="subscript"/>
+        </w:rPr>
+        <w:t>r</w:t>
+      </w:r>
+      <w:r>
+        <w:t xml:space="preserve"> giảm 45 %, t</w:t>
+      </w:r>
+      <w:r>
+        <w:rPr>
+          <w:vertAlign w:val="subscript"/>
+        </w:rPr>
+        <w:t>s</w:t>
+      </w:r>
+      <w:r>
+        <w:t xml:space="preserve"> giảm 39 %), e</w:t>
+      </w:r>
+      <w:r>
+        <w:rPr>
+          <w:vertAlign w:val="subscript"/>
+        </w:rPr>
+        <w:t>rms</w:t>
+      </w:r>
+      <w:r>
+        <w:t xml:space="preserve"> tham chiếu giảm 30,4 % (Yaw) và 6,4 % (Pitch). Tuy nhiên sai lệch vẫn cỡ vài độ và tỉ lệ với tốc độ khung mang (Hình 3.8c, d): đây là giới hạn (1.28) của cấu trúc chỉ có phản hồi, không khắc phục được bằng tăng hệ số, dẫn tới bước bù từ IMU2.</w:t>
+      </w:r>
+    </w:p>
+    <w:p>
+      <w:pPr>
         <w:keepNext/>
         <w:spacing w:before="100" w:after="60"/>
         <w:ind w:firstLine="0"/>
@@ -4906,7 +4949,7 @@
       <w:r>
         <w:drawing>
           <wp:inline xmlns:a="http://schemas.openxmlformats.org/drawingml/2006/main" xmlns:pic="http://schemas.openxmlformats.org/drawingml/2006/picture">
-            <wp:extent cx="4752000" cy="3184881"/>
+            <wp:extent cx="5696712" cy="3749039"/>
             <wp:docPr id="4" name="Picture 4"/>
             <wp:cNvGraphicFramePr>
               <a:graphicFrameLocks noChangeAspect="1"/>
@@ -4927,7 +4970,7 @@
                   <pic:spPr>
                     <a:xfrm>
                       <a:off x="0" y="0"/>
-                      <a:ext cx="4752000" cy="3184881"/>
+                      <a:ext cx="5696712" cy="3749039"/>
                     </a:xfrm>
                     <a:prstGeom prst="rect"/>
                   </pic:spPr>
@@ -6006,49 +6049,6 @@
     </w:p>
     <w:p>
       <w:pPr>
-        <w:ind w:firstLine="567"/>
-        <w:jc w:val="both"/>
-      </w:pPr>
-      <w:r>
-        <w:rPr>
-          <w:b/>
-          <w:i/>
-        </w:rPr>
-        <w:t xml:space="preserve">c) Áp dụng và đánh giá. </w:t>
-      </w:r>
-      <w:r>
-        <w:t>Bộ hệ số đã chọn (Bảng 2.4) được áp dụng cho mô hình tái hiện (Hình 3.8, Bảng 3.5). Trục Yaw bám nhanh hơn rõ (t</w:t>
-      </w:r>
-      <w:r>
-        <w:rPr>
-          <w:vertAlign w:val="subscript"/>
-        </w:rPr>
-        <w:t>r</w:t>
-      </w:r>
-      <w:r>
-        <w:t xml:space="preserve"> giảm 45 %, t</w:t>
-      </w:r>
-      <w:r>
-        <w:rPr>
-          <w:vertAlign w:val="subscript"/>
-        </w:rPr>
-        <w:t>s</w:t>
-      </w:r>
-      <w:r>
-        <w:t xml:space="preserve"> giảm 39 %), e</w:t>
-      </w:r>
-      <w:r>
-        <w:rPr>
-          <w:vertAlign w:val="subscript"/>
-        </w:rPr>
-        <w:t>rms</w:t>
-      </w:r>
-      <w:r>
-        <w:t xml:space="preserve"> tham chiếu giảm 30,4 % (Yaw) và 6,4 % (Pitch). Tuy nhiên sai lệch vẫn cỡ vài độ và tỉ lệ với tốc độ khung mang (Hình 3.8c, d): đây là giới hạn (1.28) của cấu trúc chỉ có phản hồi, không khắc phục được bằng tăng hệ số, dẫn tới bước bù từ IMU2.</w:t>
-      </w:r>
-    </w:p>
-    <w:p>
-      <w:pPr>
         <w:pStyle w:val="Heading3"/>
       </w:pPr>
       <w:bookmarkStart w:id="912" w:name="_TocN912"/>
@@ -6144,7 +6144,7 @@
       <w:r>
         <w:drawing>
           <wp:inline xmlns:a="http://schemas.openxmlformats.org/drawingml/2006/main" xmlns:pic="http://schemas.openxmlformats.org/drawingml/2006/picture">
-            <wp:extent cx="4752000" cy="2910029"/>
+            <wp:extent cx="5739384" cy="3983736"/>
             <wp:docPr id="5" name="Picture 5"/>
             <wp:cNvGraphicFramePr>
               <a:graphicFrameLocks noChangeAspect="1"/>
@@ -6165,7 +6165,7 @@
                   <pic:spPr>
                     <a:xfrm>
                       <a:off x="0" y="0"/>
-                      <a:ext cx="4752000" cy="2910029"/>
+                      <a:ext cx="5739384" cy="3983736"/>
                     </a:xfrm>
                     <a:prstGeom prst="rect"/>
                   </pic:spPr>
@@ -7063,6 +7063,40 @@
     </w:p>
     <w:p>
       <w:pPr>
+        <w:ind w:firstLine="567"/>
+        <w:jc w:val="both"/>
+      </w:pPr>
+      <w:r>
+        <w:rPr>
+          <w:b/>
+          <w:i/>
+        </w:rPr>
+        <w:t xml:space="preserve">c) Áp dụng và đánh giá. </w:t>
+      </w:r>
+      <w:r>
+        <w:t>Khâu bù với k(v) được bổ sung vào cấu hình sau hiệu chỉnh nối tầng; giá trị trước – sau ghi trực tiếp trên Hình 3.10c, giá trị của mọi cấu hình tổng hợp ở Bảng 3.15. Bù từ IMU2 là bước tác động lớn nhất: e</w:t>
+      </w:r>
+      <w:r>
+        <w:rPr>
+          <w:vertAlign w:val="subscript"/>
+        </w:rPr>
+        <w:t>rms</w:t>
+      </w:r>
+      <w:r>
+        <w:t xml:space="preserve"> giảm từ 3,80° xuống 0,406° (89,3 %) ở Yaw và từ 2,52° xuống 0,517° (79,5 %) ở Pitch mà không đổi hệ số nào của vòng kín – khâu bù giảm nhiễu hiệu dụng chứ không lấn vào dự trữ ổn định (mục 1.3.2). Hai hạn chế còn lại: sai lệch dư tập trung ở các pha tăng tốc, giảm tốc (lệnh bù đến muộn), và lệnh bắt đầu chạm giới hạn 135 °/s ở các đoạn nhanh (ρ</w:t>
+      </w:r>
+      <w:r>
+        <w:rPr>
+          <w:vertAlign w:val="subscript"/>
+        </w:rPr>
+        <w:t>sat</w:t>
+      </w:r>
+      <w:r>
+        <w:t xml:space="preserve"> = 1,04 / 4,78 %) vì phần bù nay lớn gần bằng tốc độ khung mang.</w:t>
+      </w:r>
+    </w:p>
+    <w:p>
+      <w:pPr>
         <w:keepNext/>
         <w:spacing w:before="100" w:after="60"/>
         <w:ind w:firstLine="0"/>
@@ -7071,7 +7105,7 @@
       <w:r>
         <w:drawing>
           <wp:inline xmlns:a="http://schemas.openxmlformats.org/drawingml/2006/main" xmlns:pic="http://schemas.openxmlformats.org/drawingml/2006/picture">
-            <wp:extent cx="4752000" cy="2513739"/>
+            <wp:extent cx="5690616" cy="3846576"/>
             <wp:docPr id="6" name="Picture 6"/>
             <wp:cNvGraphicFramePr>
               <a:graphicFrameLocks noChangeAspect="1"/>
@@ -7092,7 +7126,7 @@
                   <pic:spPr>
                     <a:xfrm>
                       <a:off x="0" y="0"/>
-                      <a:ext cx="4752000" cy="2513739"/>
+                      <a:ext cx="5690616" cy="3846576"/>
                     </a:xfrm>
                     <a:prstGeom prst="rect"/>
                   </pic:spPr>
@@ -7111,40 +7145,6 @@
       <w:bookmarkEnd w:id="915"/>
       <w:r>
         <w:t>Hình 3.10. Trước và sau bổ sung bù chuyển động khung mang từ IMU2 (mô phỏng tái hiện)</w:t>
-      </w:r>
-    </w:p>
-    <w:p>
-      <w:pPr>
-        <w:ind w:firstLine="567"/>
-        <w:jc w:val="both"/>
-      </w:pPr>
-      <w:r>
-        <w:rPr>
-          <w:b/>
-          <w:i/>
-        </w:rPr>
-        <w:t xml:space="preserve">c) Áp dụng và đánh giá. </w:t>
-      </w:r>
-      <w:r>
-        <w:t>Khâu bù với k(v) được bổ sung vào cấu hình sau hiệu chỉnh nối tầng; giá trị trước – sau ghi trực tiếp trên Hình 3.10c, giá trị của mọi cấu hình tổng hợp ở Bảng 3.15. Bù từ IMU2 là bước tác động lớn nhất: e</w:t>
-      </w:r>
-      <w:r>
-        <w:rPr>
-          <w:vertAlign w:val="subscript"/>
-        </w:rPr>
-        <w:t>rms</w:t>
-      </w:r>
-      <w:r>
-        <w:t xml:space="preserve"> giảm từ 3,80° xuống 0,406° (89,3 %) ở Yaw và từ 2,52° xuống 0,517° (79,5 %) ở Pitch mà không đổi hệ số nào của vòng kín – khâu bù giảm nhiễu hiệu dụng chứ không lấn vào dự trữ ổn định (mục 1.3.2). Hai hạn chế còn lại: sai lệch dư tập trung ở các pha tăng tốc, giảm tốc (lệnh bù đến muộn), và lệnh bắt đầu chạm giới hạn 135 °/s ở các đoạn nhanh (ρ</w:t>
-      </w:r>
-      <w:r>
-        <w:rPr>
-          <w:vertAlign w:val="subscript"/>
-        </w:rPr>
-        <w:t>sat</w:t>
-      </w:r>
-      <w:r>
-        <w:t xml:space="preserve"> = 1,04 / 4,78 %) vì phần bù nay lớn gần bằng tốc độ khung mang.</w:t>
       </w:r>
     </w:p>
     <w:p>
@@ -7488,7 +7488,7 @@
       <w:r>
         <w:drawing>
           <wp:inline xmlns:a="http://schemas.openxmlformats.org/drawingml/2006/main" xmlns:pic="http://schemas.openxmlformats.org/drawingml/2006/picture">
-            <wp:extent cx="4752000" cy="2966766"/>
+            <wp:extent cx="5739384" cy="3974592"/>
             <wp:docPr id="7" name="Picture 7"/>
             <wp:cNvGraphicFramePr>
               <a:graphicFrameLocks noChangeAspect="1"/>
@@ -7509,7 +7509,7 @@
                   <pic:spPr>
                     <a:xfrm>
                       <a:off x="0" y="0"/>
-                      <a:ext cx="4752000" cy="2966766"/>
+                      <a:ext cx="5739384" cy="3974592"/>
                     </a:xfrm>
                     <a:prstGeom prst="rect"/>
                   </pic:spPr>
@@ -8717,6 +8717,67 @@
     </w:p>
     <w:p>
       <w:pPr>
+        <w:ind w:firstLine="567"/>
+        <w:jc w:val="both"/>
+      </w:pPr>
+      <w:r>
+        <w:rPr>
+          <w:b/>
+          <w:i/>
+        </w:rPr>
+        <w:t xml:space="preserve">c) Áp dụng và đánh giá. </w:t>
+      </w:r>
+      <w:r>
+        <w:t>Ngoại suy τ</w:t>
+      </w:r>
+      <w:r>
+        <w:rPr>
+          <w:vertAlign w:val="subscript"/>
+        </w:rPr>
+        <w:t>p</w:t>
+      </w:r>
+      <w:r>
+        <w:t xml:space="preserve"> = 12 ms, Δω</w:t>
+      </w:r>
+      <w:r>
+        <w:rPr>
+          <w:vertAlign w:val="subscript"/>
+        </w:rPr>
+        <w:t>max</w:t>
+      </w:r>
+      <w:r>
+        <w:t xml:space="preserve"> = 90 °/s được bổ sung vào cấu hình có bù IMU2 (Hình 3.12). e</w:t>
+      </w:r>
+      <w:r>
+        <w:rPr>
+          <w:vertAlign w:val="subscript"/>
+        </w:rPr>
+        <w:t>rms</w:t>
+      </w:r>
+      <w:r>
+        <w:t xml:space="preserve"> giảm từ 0,406° xuống 0,263° (35,2 %) ở Yaw và từ 0,517° xuống 0,309° (40,3 %) ở Pitch; sai lệch ở các pha tăng tốc – giảm tốc bị triệt gần hết (Hình 3.12a, b). Ý nghĩa của bước này là đưa lệnh bù về đúng thời điểm có hiệu lực mà không cần giảm trễ vật lý. Tuy nhiên e</w:t>
+      </w:r>
+      <w:r>
+        <w:rPr>
+          <w:vertAlign w:val="subscript"/>
+        </w:rPr>
+        <w:t>max</w:t>
+      </w:r>
+      <w:r>
+        <w:t xml:space="preserve"> gần như không đổi (6,39 → 5,84° ở Yaw) vì đỉnh sai lệch lớn nhất nằm ở đoạn 4 – 5, nơi lệnh bị cắt ở 135 °/s (ρ</w:t>
+      </w:r>
+      <w:r>
+        <w:rPr>
+          <w:vertAlign w:val="subscript"/>
+        </w:rPr>
+        <w:t>sat</w:t>
+      </w:r>
+      <w:r>
+        <w:t xml:space="preserve"> = 1,04 / 3,99 %).</w:t>
+      </w:r>
+    </w:p>
+    <w:p>
+      <w:pPr>
         <w:keepNext/>
         <w:spacing w:before="100" w:after="60"/>
         <w:ind w:firstLine="0"/>
@@ -8725,7 +8786,7 @@
       <w:r>
         <w:drawing>
           <wp:inline xmlns:a="http://schemas.openxmlformats.org/drawingml/2006/main" xmlns:pic="http://schemas.openxmlformats.org/drawingml/2006/picture">
-            <wp:extent cx="4752000" cy="2513739"/>
+            <wp:extent cx="5626608" cy="3846576"/>
             <wp:docPr id="8" name="Picture 8"/>
             <wp:cNvGraphicFramePr>
               <a:graphicFrameLocks noChangeAspect="1"/>
@@ -8746,7 +8807,7 @@
                   <pic:spPr>
                     <a:xfrm>
                       <a:off x="0" y="0"/>
-                      <a:ext cx="4752000" cy="2513739"/>
+                      <a:ext cx="5626608" cy="3846576"/>
                     </a:xfrm>
                     <a:prstGeom prst="rect"/>
                   </pic:spPr>
@@ -8769,67 +8830,6 @@
     </w:p>
     <w:p>
       <w:pPr>
-        <w:ind w:firstLine="567"/>
-        <w:jc w:val="both"/>
-      </w:pPr>
-      <w:r>
-        <w:rPr>
-          <w:b/>
-          <w:i/>
-        </w:rPr>
-        <w:t xml:space="preserve">c) Áp dụng và đánh giá. </w:t>
-      </w:r>
-      <w:r>
-        <w:t>Ngoại suy τ</w:t>
-      </w:r>
-      <w:r>
-        <w:rPr>
-          <w:vertAlign w:val="subscript"/>
-        </w:rPr>
-        <w:t>p</w:t>
-      </w:r>
-      <w:r>
-        <w:t xml:space="preserve"> = 12 ms, Δω</w:t>
-      </w:r>
-      <w:r>
-        <w:rPr>
-          <w:vertAlign w:val="subscript"/>
-        </w:rPr>
-        <w:t>max</w:t>
-      </w:r>
-      <w:r>
-        <w:t xml:space="preserve"> = 90 °/s được bổ sung vào cấu hình có bù IMU2 (Hình 3.12). e</w:t>
-      </w:r>
-      <w:r>
-        <w:rPr>
-          <w:vertAlign w:val="subscript"/>
-        </w:rPr>
-        <w:t>rms</w:t>
-      </w:r>
-      <w:r>
-        <w:t xml:space="preserve"> giảm từ 0,406° xuống 0,263° (35,2 %) ở Yaw và từ 0,517° xuống 0,309° (40,3 %) ở Pitch; sai lệch ở các pha tăng tốc – giảm tốc bị triệt gần hết (Hình 3.12a, b). Ý nghĩa của bước này là đưa lệnh bù về đúng thời điểm có hiệu lực mà không cần giảm trễ vật lý. Tuy nhiên e</w:t>
-      </w:r>
-      <w:r>
-        <w:rPr>
-          <w:vertAlign w:val="subscript"/>
-        </w:rPr>
-        <w:t>max</w:t>
-      </w:r>
-      <w:r>
-        <w:t xml:space="preserve"> gần như không đổi (6,39 → 5,84° ở Yaw) vì đỉnh sai lệch lớn nhất nằm ở đoạn 4 – 5, nơi lệnh bị cắt ở 135 °/s (ρ</w:t>
-      </w:r>
-      <w:r>
-        <w:rPr>
-          <w:vertAlign w:val="subscript"/>
-        </w:rPr>
-        <w:t>sat</w:t>
-      </w:r>
-      <w:r>
-        <w:t xml:space="preserve"> = 1,04 / 3,99 %).</w:t>
-      </w:r>
-    </w:p>
-    <w:p>
-      <w:pPr>
         <w:pStyle w:val="Heading2"/>
       </w:pPr>
       <w:bookmarkStart w:id="920" w:name="_TocN920"/>
@@ -8917,7 +8917,7 @@
       <w:r>
         <w:drawing>
           <wp:inline xmlns:a="http://schemas.openxmlformats.org/drawingml/2006/main" xmlns:pic="http://schemas.openxmlformats.org/drawingml/2006/picture">
-            <wp:extent cx="4752000" cy="2588028"/>
+            <wp:extent cx="5740908" cy="4288536"/>
             <wp:docPr id="9" name="Picture 9"/>
             <wp:cNvGraphicFramePr>
               <a:graphicFrameLocks noChangeAspect="1"/>
@@ -8938,7 +8938,7 @@
                   <pic:spPr>
                     <a:xfrm>
                       <a:off x="0" y="0"/>
-                      <a:ext cx="4752000" cy="2588028"/>
+                      <a:ext cx="5740908" cy="4288536"/>
                     </a:xfrm>
                     <a:prstGeom prst="rect"/>
                   </pic:spPr>
@@ -9909,6 +9909,58 @@
     </w:p>
     <w:p>
       <w:pPr>
+        <w:ind w:firstLine="567"/>
+        <w:jc w:val="both"/>
+      </w:pPr>
+      <w:r>
+        <w:rPr>
+          <w:b/>
+          <w:i/>
+        </w:rPr>
+        <w:t xml:space="preserve">c) Áp dụng và đánh giá. </w:t>
+      </w:r>
+      <w:r>
+        <w:t>Giới hạn theo vùng được bổ sung vào cấu hình có ngoại suy bù trễ (Hình 3.14). ρ</w:t>
+      </w:r>
+      <w:r>
+        <w:rPr>
+          <w:vertAlign w:val="subscript"/>
+        </w:rPr>
+        <w:t>sat</w:t>
+      </w:r>
+      <w:r>
+        <w:t xml:space="preserve"> giảm từ 1,04 % xuống 0,01 % (Yaw) và từ 3,99 % xuống 0,00 % (Pitch); nhờ phần lệnh không còn bị cắt, e</w:t>
+      </w:r>
+      <w:r>
+        <w:rPr>
+          <w:vertAlign w:val="subscript"/>
+        </w:rPr>
+        <w:t>max</w:t>
+      </w:r>
+      <w:r>
+        <w:t xml:space="preserve"> tái hiện giảm 87 % (Yaw) và 65 % (Pitch), e</w:t>
+      </w:r>
+      <w:r>
+        <w:rPr>
+          <w:vertAlign w:val="subscript"/>
+        </w:rPr>
+        <w:t>rms</w:t>
+      </w:r>
+      <w:r>
+        <w:t xml:space="preserve"> giảm 42,2 % và 35,3 %. Đây là bước giảm sai lệch lớn thứ hai vì bài thử tham chiếu có tốc độ khung mang vượt xa giới hạn cố định. Sau bước này e</w:t>
+      </w:r>
+      <w:r>
+        <w:rPr>
+          <w:vertAlign w:val="subscript"/>
+        </w:rPr>
+        <w:t>rms</w:t>
+      </w:r>
+      <w:r>
+        <w:t xml:space="preserve"> tái hiện còn 0,152° (Yaw), 0,200° (Pitch); phần còn lại tập trung quanh các lần khung mang đổi chiều.</w:t>
+      </w:r>
+    </w:p>
+    <w:p>
+      <w:pPr>
         <w:keepNext/>
         <w:spacing w:before="100" w:after="60"/>
         <w:ind w:firstLine="0"/>
@@ -9917,7 +9969,7 @@
       <w:r>
         <w:drawing>
           <wp:inline xmlns:a="http://schemas.openxmlformats.org/drawingml/2006/main" xmlns:pic="http://schemas.openxmlformats.org/drawingml/2006/picture">
-            <wp:extent cx="4752000" cy="2513739"/>
+            <wp:extent cx="5739384" cy="4140708"/>
             <wp:docPr id="10" name="Picture 10"/>
             <wp:cNvGraphicFramePr>
               <a:graphicFrameLocks noChangeAspect="1"/>
@@ -9938,7 +9990,7 @@
                   <pic:spPr>
                     <a:xfrm>
                       <a:off x="0" y="0"/>
-                      <a:ext cx="4752000" cy="2513739"/>
+                      <a:ext cx="5739384" cy="4140708"/>
                     </a:xfrm>
                     <a:prstGeom prst="rect"/>
                   </pic:spPr>
@@ -9961,58 +10013,6 @@
     </w:p>
     <w:p>
       <w:pPr>
-        <w:ind w:firstLine="567"/>
-        <w:jc w:val="both"/>
-      </w:pPr>
-      <w:r>
-        <w:rPr>
-          <w:b/>
-          <w:i/>
-        </w:rPr>
-        <w:t xml:space="preserve">c) Áp dụng và đánh giá. </w:t>
-      </w:r>
-      <w:r>
-        <w:t>Giới hạn theo vùng được bổ sung vào cấu hình có ngoại suy bù trễ (Hình 3.14). ρ</w:t>
-      </w:r>
-      <w:r>
-        <w:rPr>
-          <w:vertAlign w:val="subscript"/>
-        </w:rPr>
-        <w:t>sat</w:t>
-      </w:r>
-      <w:r>
-        <w:t xml:space="preserve"> giảm từ 1,04 % xuống 0,01 % (Yaw) và từ 3,99 % xuống 0,00 % (Pitch); nhờ phần lệnh không còn bị cắt, e</w:t>
-      </w:r>
-      <w:r>
-        <w:rPr>
-          <w:vertAlign w:val="subscript"/>
-        </w:rPr>
-        <w:t>max</w:t>
-      </w:r>
-      <w:r>
-        <w:t xml:space="preserve"> tái hiện giảm 87 % (Yaw) và 65 % (Pitch), e</w:t>
-      </w:r>
-      <w:r>
-        <w:rPr>
-          <w:vertAlign w:val="subscript"/>
-        </w:rPr>
-        <w:t>rms</w:t>
-      </w:r>
-      <w:r>
-        <w:t xml:space="preserve"> giảm 42,2 % và 35,3 %. Đây là bước giảm sai lệch lớn thứ hai vì bài thử tham chiếu có tốc độ khung mang vượt xa giới hạn cố định. Sau bước này e</w:t>
-      </w:r>
-      <w:r>
-        <w:rPr>
-          <w:vertAlign w:val="subscript"/>
-        </w:rPr>
-        <w:t>rms</w:t>
-      </w:r>
-      <w:r>
-        <w:t xml:space="preserve"> tái hiện còn 0,152° (Yaw), 0,200° (Pitch); phần còn lại tập trung quanh các lần khung mang đổi chiều.</w:t>
-      </w:r>
-    </w:p>
-    <w:p>
-      <w:pPr>
         <w:pStyle w:val="Heading3"/>
       </w:pPr>
       <w:bookmarkStart w:id="925" w:name="_TocN925"/>
@@ -10099,7 +10099,7 @@
       <w:r>
         <w:drawing>
           <wp:inline xmlns:a="http://schemas.openxmlformats.org/drawingml/2006/main" xmlns:pic="http://schemas.openxmlformats.org/drawingml/2006/picture">
-            <wp:extent cx="4752000" cy="3292903"/>
+            <wp:extent cx="5742432" cy="4136136"/>
             <wp:docPr id="11" name="Picture 11"/>
             <wp:cNvGraphicFramePr>
               <a:graphicFrameLocks noChangeAspect="1"/>
@@ -10120,7 +10120,7 @@
                   <pic:spPr>
                     <a:xfrm>
                       <a:off x="0" y="0"/>
-                      <a:ext cx="4752000" cy="3292903"/>
+                      <a:ext cx="5742432" cy="4136136"/>
                     </a:xfrm>
                     <a:prstGeom prst="rect"/>
                   </pic:spPr>
@@ -11045,6 +11045,31 @@
     </w:p>
     <w:p>
       <w:pPr>
+        <w:ind w:firstLine="567"/>
+        <w:jc w:val="both"/>
+      </w:pPr>
+      <w:r>
+        <w:rPr>
+          <w:b/>
+          <w:i/>
+        </w:rPr>
+        <w:t xml:space="preserve">c) Áp dụng và đánh giá. </w:t>
+      </w:r>
+      <w:r>
+        <w:t>Hai cơ chế được bổ sung vào cấu hình có giới hạn lệnh động và đánh giá trên bài thử tham chiếu, các lần đổi chiều và bài thử dừng đột ngột 12 lượt mỗi trục (Hình 3.16, Bảng 3.10). Bước này gần như trung tính với sai lệch: e</w:t>
+      </w:r>
+      <w:r>
+        <w:rPr>
+          <w:vertAlign w:val="subscript"/>
+        </w:rPr>
+        <w:t>rms</w:t>
+      </w:r>
+      <w:r>
+        <w:t xml:space="preserve"> thay đổi +0,2 % (Yaw), +3,7 % (Pitch); đỉnh sai lệch khi dừng (0,36° / 0,67°) không đổi vì với bù, ngoại suy và giới hạn động, hệ đã phục hồi trước khi trạng thái dừng được xác nhận (220 ms). Tác dụng đo được của chế độ dừng là ở giai đoạn giữ (Hình 3.15c, d): trên trục Yaw lệnh lớn nhất giảm từ 1,03 xuống 0,41 °/s, độ lệch chuẩn lệnh giảm 85 %, động cơ không còn bị kích liên tục quanh ma sát tĩnh; trục Pitch cải thiện ít hơn. Các hiện tượng mà hai cơ chế hướng tới – rung của IMU2, trôi điểm không khi dừng lâu, lượng tử của vòng tốc độ tích hợp gần tốc độ không – chưa có trong mô hình, nên hiệu quả của chúng cần xác nhận bằng thực nghiệm. Lệnh vẫn còn các bước nhảy lớn ở lần chuyển vùng, đổi chiều và thoát chế độ dừng.</w:t>
+      </w:r>
+    </w:p>
+    <w:p>
+      <w:pPr>
         <w:keepNext/>
         <w:spacing w:before="100" w:after="60"/>
         <w:ind w:firstLine="0"/>
@@ -11053,7 +11078,7 @@
       <w:r>
         <w:drawing>
           <wp:inline xmlns:a="http://schemas.openxmlformats.org/drawingml/2006/main" xmlns:pic="http://schemas.openxmlformats.org/drawingml/2006/picture">
-            <wp:extent cx="4752000" cy="2454898"/>
+            <wp:extent cx="5739384" cy="4140708"/>
             <wp:docPr id="12" name="Picture 12"/>
             <wp:cNvGraphicFramePr>
               <a:graphicFrameLocks noChangeAspect="1"/>
@@ -11074,7 +11099,7 @@
                   <pic:spPr>
                     <a:xfrm>
                       <a:off x="0" y="0"/>
-                      <a:ext cx="4752000" cy="2454898"/>
+                      <a:ext cx="5739384" cy="4140708"/>
                     </a:xfrm>
                     <a:prstGeom prst="rect"/>
                   </pic:spPr>
@@ -12114,31 +12139,6 @@
     </w:p>
     <w:p>
       <w:pPr>
-        <w:ind w:firstLine="567"/>
-        <w:jc w:val="both"/>
-      </w:pPr>
-      <w:r>
-        <w:rPr>
-          <w:b/>
-          <w:i/>
-        </w:rPr>
-        <w:t xml:space="preserve">c) Áp dụng và đánh giá. </w:t>
-      </w:r>
-      <w:r>
-        <w:t>Hai cơ chế được bổ sung vào cấu hình có giới hạn lệnh động và đánh giá trên bài thử tham chiếu, các lần đổi chiều và bài thử dừng đột ngột 12 lượt mỗi trục (Hình 3.16, Bảng 3.10). Bước này gần như trung tính với sai lệch: e</w:t>
-      </w:r>
-      <w:r>
-        <w:rPr>
-          <w:vertAlign w:val="subscript"/>
-        </w:rPr>
-        <w:t>rms</w:t>
-      </w:r>
-      <w:r>
-        <w:t xml:space="preserve"> thay đổi +0,2 % (Yaw), +3,7 % (Pitch); đỉnh sai lệch khi dừng (0,36° / 0,67°) không đổi vì với bù, ngoại suy và giới hạn động, hệ đã phục hồi trước khi trạng thái dừng được xác nhận (220 ms). Tác dụng đo được của chế độ dừng là ở giai đoạn giữ: trên trục Yaw lệnh lớn nhất giảm từ 1,03 xuống 0,41 °/s, độ lệch chuẩn lệnh giảm 85 %, động cơ không còn bị kích liên tục quanh ma sát tĩnh; trục Pitch cải thiện ít hơn. Các hiện tượng mà hai cơ chế hướng tới – rung của IMU2, trôi điểm không khi dừng lâu, lượng tử của vòng tốc độ tích hợp gần tốc độ không – chưa có trong mô hình, nên hiệu quả của chúng cần xác nhận bằng thực nghiệm. Lệnh vẫn còn các bước nhảy lớn ở lần chuyển vùng, đổi chiều và thoát chế độ dừng.</w:t>
-      </w:r>
-    </w:p>
-    <w:p>
-      <w:pPr>
         <w:pStyle w:val="Heading3"/>
       </w:pPr>
       <w:bookmarkStart w:id="930" w:name="_TocN930"/>
@@ -12225,7 +12225,7 @@
       <w:r>
         <w:drawing>
           <wp:inline xmlns:a="http://schemas.openxmlformats.org/drawingml/2006/main" xmlns:pic="http://schemas.openxmlformats.org/drawingml/2006/picture">
-            <wp:extent cx="4752000" cy="2795628"/>
+            <wp:extent cx="5632704" cy="4287012"/>
             <wp:docPr id="13" name="Picture 13"/>
             <wp:cNvGraphicFramePr>
               <a:graphicFrameLocks noChangeAspect="1"/>
@@ -12246,7 +12246,7 @@
                   <pic:spPr>
                     <a:xfrm>
                       <a:off x="0" y="0"/>
-                      <a:ext cx="4752000" cy="2795628"/>
+                      <a:ext cx="5632704" cy="4287012"/>
                     </a:xfrm>
                     <a:prstGeom prst="rect"/>
                   </pic:spPr>
@@ -13084,6 +13084,40 @@
     </w:p>
     <w:p>
       <w:pPr>
+        <w:ind w:firstLine="567"/>
+        <w:jc w:val="both"/>
+      </w:pPr>
+      <w:r>
+        <w:rPr>
+          <w:b/>
+          <w:i/>
+        </w:rPr>
+        <w:t xml:space="preserve">c) Áp dụng và đánh giá. </w:t>
+      </w:r>
+      <w:r>
+        <w:t>Khâu tạo dạng được bổ sung vào cấu hình có xử lý đảo chiều và dừng (Hình 3.18, giá trị trước – sau ghi trên hình). Khâu tạo dạng tác động chủ yếu lên lệnh: bước lệnh lớn nhất giảm 4 % (Yaw) và 38 % (Pitch), nên dạng dao động 16,5 Hz ít bị kích thích khi lệnh chuyển trạng thái. Cái giá là trễ nhỏ khi lệnh đổi nhanh: e</w:t>
+      </w:r>
+      <w:r>
+        <w:rPr>
+          <w:vertAlign w:val="subscript"/>
+        </w:rPr>
+        <w:t>rms</w:t>
+      </w:r>
+      <w:r>
+        <w:t xml:space="preserve"> thay đổi 0,0 % (Yaw), +2,0 % (Pitch) – một đánh đổi có chủ đích với chi phí vài phần trăm. Sau bước này e</w:t>
+      </w:r>
+      <w:r>
+        <w:rPr>
+          <w:vertAlign w:val="subscript"/>
+        </w:rPr>
+        <w:t>rms</w:t>
+      </w:r>
+      <w:r>
+        <w:t xml:space="preserve"> tái hiện trục Pitch (0,212°) lớn hơn Yaw (0,152°) dù Pitch có quán tính nhỏ hơn; các đỉnh sai lệch Pitch trùng với những lần khoảng cập nhật lệnh Pitch bị kéo dài do lịch ưu tiên Yaw.</w:t>
+      </w:r>
+    </w:p>
+    <w:p>
+      <w:pPr>
         <w:keepNext/>
         <w:spacing w:before="100" w:after="60"/>
         <w:ind w:firstLine="0"/>
@@ -13092,7 +13126,7 @@
       <w:r>
         <w:drawing>
           <wp:inline xmlns:a="http://schemas.openxmlformats.org/drawingml/2006/main" xmlns:pic="http://schemas.openxmlformats.org/drawingml/2006/picture">
-            <wp:extent cx="4752000" cy="2376000"/>
+            <wp:extent cx="5739384" cy="4140708"/>
             <wp:docPr id="14" name="Picture 14"/>
             <wp:cNvGraphicFramePr>
               <a:graphicFrameLocks noChangeAspect="1"/>
@@ -13113,7 +13147,7 @@
                   <pic:spPr>
                     <a:xfrm>
                       <a:off x="0" y="0"/>
-                      <a:ext cx="4752000" cy="2376000"/>
+                      <a:ext cx="5739384" cy="4140708"/>
                     </a:xfrm>
                     <a:prstGeom prst="rect"/>
                   </pic:spPr>
@@ -13132,40 +13166,6 @@
       <w:bookmarkEnd w:id="933"/>
       <w:r>
         <w:t>Hình 3.18. Trước và sau bổ sung khâu tạo dạng lệnh (mô phỏng tái hiện)</w:t>
-      </w:r>
-    </w:p>
-    <w:p>
-      <w:pPr>
-        <w:ind w:firstLine="567"/>
-        <w:jc w:val="both"/>
-      </w:pPr>
-      <w:r>
-        <w:rPr>
-          <w:b/>
-          <w:i/>
-        </w:rPr>
-        <w:t xml:space="preserve">c) Áp dụng và đánh giá. </w:t>
-      </w:r>
-      <w:r>
-        <w:t>Khâu tạo dạng được bổ sung vào cấu hình có xử lý đảo chiều và dừng (Hình 3.18, giá trị trước – sau ghi trên hình). Khâu tạo dạng tác động chủ yếu lên lệnh: bước lệnh lớn nhất giảm 4 % (Yaw) và 38 % (Pitch), nên dạng dao động 16,5 Hz ít bị kích thích khi lệnh chuyển trạng thái. Cái giá là trễ nhỏ khi lệnh đổi nhanh: e</w:t>
-      </w:r>
-      <w:r>
-        <w:rPr>
-          <w:vertAlign w:val="subscript"/>
-        </w:rPr>
-        <w:t>rms</w:t>
-      </w:r>
-      <w:r>
-        <w:t xml:space="preserve"> thay đổi 0,0 % (Yaw), +2,0 % (Pitch) – một đánh đổi có chủ đích với chi phí vài phần trăm. Sau bước này e</w:t>
-      </w:r>
-      <w:r>
-        <w:rPr>
-          <w:vertAlign w:val="subscript"/>
-        </w:rPr>
-        <w:t>rms</w:t>
-      </w:r>
-      <w:r>
-        <w:t xml:space="preserve"> tái hiện trục Pitch (0,212°) lớn hơn Yaw (0,152°) dù Pitch có quán tính nhỏ hơn; các đỉnh sai lệch Pitch trùng với những lần khoảng cập nhật lệnh Pitch bị kéo dài do lịch ưu tiên Yaw.</w:t>
       </w:r>
     </w:p>
     <w:p>
@@ -13549,7 +13549,7 @@
       <w:r>
         <w:drawing>
           <wp:inline xmlns:a="http://schemas.openxmlformats.org/drawingml/2006/main" xmlns:pic="http://schemas.openxmlformats.org/drawingml/2006/picture">
-            <wp:extent cx="5400000" cy="2351167"/>
+            <wp:extent cx="5625084" cy="2375916"/>
             <wp:docPr id="15" name="Picture 15"/>
             <wp:cNvGraphicFramePr>
               <a:graphicFrameLocks noChangeAspect="1"/>
@@ -13570,7 +13570,7 @@
                   <pic:spPr>
                     <a:xfrm>
                       <a:off x="0" y="0"/>
-                      <a:ext cx="5400000" cy="2351167"/>
+                      <a:ext cx="5625084" cy="2375916"/>
                     </a:xfrm>
                     <a:prstGeom prst="rect"/>
                   </pic:spPr>
@@ -14564,6 +14564,49 @@
     </w:p>
     <w:p>
       <w:pPr>
+        <w:ind w:firstLine="567"/>
+        <w:jc w:val="both"/>
+      </w:pPr>
+      <w:r>
+        <w:rPr>
+          <w:b/>
+          <w:i/>
+        </w:rPr>
+        <w:t xml:space="preserve">c) Áp dụng và đánh giá. </w:t>
+      </w:r>
+      <w:r>
+        <w:t>Áp dụng lịch luân phiên cho cấu hình có tạo dạng lệnh cho ra cấu hình hoàn thiện; bước này có cả số đo log A (Hình 3.20, Bảng 3.13). Lịch luân phiên giảm e</w:t>
+      </w:r>
+      <w:r>
+        <w:rPr>
+          <w:vertAlign w:val="subscript"/>
+        </w:rPr>
+        <w:t>rms</w:t>
+      </w:r>
+      <w:r>
+        <w:t xml:space="preserve"> Pitch 9,5 % và phân vị 99 % 12,7 %, đổi lại e</w:t>
+      </w:r>
+      <w:r>
+        <w:rPr>
+          <w:vertAlign w:val="subscript"/>
+        </w:rPr>
+        <w:t>rms</w:t>
+      </w:r>
+      <w:r>
+        <w:t xml:space="preserve"> Yaw tăng 19,5 %; hai trục trở nên cân bằng (0,182° / 0,192°) và sai lệch lớn hơn trong hai trục giảm từ 0,212° xuống 0,192°. Số đo log A xác nhận: e</w:t>
+      </w:r>
+      <w:r>
+        <w:rPr>
+          <w:vertAlign w:val="subscript"/>
+        </w:rPr>
+        <w:t>rms</w:t>
+      </w:r>
+      <w:r>
+        <w:t xml:space="preserve"> = 0,199° (Yaw), 0,201° (Pitch). Bộ đếm RS485 trong log A ghi mỗi trục 7 676 giao dịch trong 76,3 s (100,6 Hz), không có giao dịch lỗi hay quá hạn; khoảng cập nhật lớn nhất 16 ms (Yaw), 14 ms (Pitch), giao dịch dài nhất 8 ms – tính tất định cải thiện rõ nhưng chưa tuyệt đối.</w:t>
+      </w:r>
+    </w:p>
+    <w:p>
+      <w:pPr>
         <w:keepNext/>
         <w:spacing w:before="100" w:after="60"/>
         <w:ind w:firstLine="0"/>
@@ -14572,7 +14615,7 @@
       <w:r>
         <w:drawing>
           <wp:inline xmlns:a="http://schemas.openxmlformats.org/drawingml/2006/main" xmlns:pic="http://schemas.openxmlformats.org/drawingml/2006/picture">
-            <wp:extent cx="4752000" cy="2550706"/>
+            <wp:extent cx="5626608" cy="3846576"/>
             <wp:docPr id="16" name="Picture 16"/>
             <wp:cNvGraphicFramePr>
               <a:graphicFrameLocks noChangeAspect="1"/>
@@ -14593,7 +14636,7 @@
                   <pic:spPr>
                     <a:xfrm>
                       <a:off x="0" y="0"/>
-                      <a:ext cx="4752000" cy="2550706"/>
+                      <a:ext cx="5626608" cy="3846576"/>
                     </a:xfrm>
                     <a:prstGeom prst="rect"/>
                   </pic:spPr>
@@ -15399,49 +15442,6 @@
     </w:p>
     <w:p>
       <w:pPr>
-        <w:ind w:firstLine="567"/>
-        <w:jc w:val="both"/>
-      </w:pPr>
-      <w:r>
-        <w:rPr>
-          <w:b/>
-          <w:i/>
-        </w:rPr>
-        <w:t xml:space="preserve">c) Áp dụng và đánh giá. </w:t>
-      </w:r>
-      <w:r>
-        <w:t>Áp dụng lịch luân phiên cho cấu hình có tạo dạng lệnh cho ra cấu hình hoàn thiện; bước này có cả số đo log A (Hình 3.20, Bảng 3.13). Lịch luân phiên giảm e</w:t>
-      </w:r>
-      <w:r>
-        <w:rPr>
-          <w:vertAlign w:val="subscript"/>
-        </w:rPr>
-        <w:t>rms</w:t>
-      </w:r>
-      <w:r>
-        <w:t xml:space="preserve"> Pitch 9,5 % và phân vị 99 % 12,7 %, đổi lại e</w:t>
-      </w:r>
-      <w:r>
-        <w:rPr>
-          <w:vertAlign w:val="subscript"/>
-        </w:rPr>
-        <w:t>rms</w:t>
-      </w:r>
-      <w:r>
-        <w:t xml:space="preserve"> Yaw tăng 19,5 %; hai trục trở nên cân bằng (0,182° / 0,192°) và sai lệch lớn hơn trong hai trục giảm từ 0,212° xuống 0,192°. Số đo log A xác nhận: e</w:t>
-      </w:r>
-      <w:r>
-        <w:rPr>
-          <w:vertAlign w:val="subscript"/>
-        </w:rPr>
-        <w:t>rms</w:t>
-      </w:r>
-      <w:r>
-        <w:t xml:space="preserve"> = 0,199° (Yaw), 0,201° (Pitch). Bộ đếm RS485 trong log A ghi mỗi trục 7 676 giao dịch trong 76,3 s (100,6 Hz), không có giao dịch lỗi hay quá hạn; khoảng cập nhật lớn nhất 16 ms (Yaw), 14 ms (Pitch), giao dịch dài nhất 8 ms – tính tất định cải thiện rõ nhưng chưa tuyệt đối.</w:t>
-      </w:r>
-    </w:p>
-    <w:p>
-      <w:pPr>
         <w:pStyle w:val="Heading3"/>
       </w:pPr>
       <w:bookmarkStart w:id="940" w:name="_TocN940"/>
@@ -15476,7 +15476,7 @@
       <w:r>
         <w:drawing>
           <wp:inline xmlns:a="http://schemas.openxmlformats.org/drawingml/2006/main" xmlns:pic="http://schemas.openxmlformats.org/drawingml/2006/picture">
-            <wp:extent cx="5400000" cy="3728336"/>
+            <wp:extent cx="5626608" cy="5553456"/>
             <wp:docPr id="17" name="Picture 17"/>
             <wp:cNvGraphicFramePr>
               <a:graphicFrameLocks noChangeAspect="1"/>
@@ -15497,7 +15497,7 @@
                   <pic:spPr>
                     <a:xfrm>
                       <a:off x="0" y="0"/>
-                      <a:ext cx="5400000" cy="3728336"/>
+                      <a:ext cx="5626608" cy="5553456"/>
                     </a:xfrm>
                     <a:prstGeom prst="rect"/>
                   </pic:spPr>
@@ -16942,7 +16942,7 @@
       <w:r>
         <w:drawing>
           <wp:inline xmlns:a="http://schemas.openxmlformats.org/drawingml/2006/main" xmlns:pic="http://schemas.openxmlformats.org/drawingml/2006/picture">
-            <wp:extent cx="5400000" cy="3180328"/>
+            <wp:extent cx="5625084" cy="3558540"/>
             <wp:docPr id="18" name="Picture 18"/>
             <wp:cNvGraphicFramePr>
               <a:graphicFrameLocks noChangeAspect="1"/>
@@ -16963,7 +16963,7 @@
                   <pic:spPr>
                     <a:xfrm>
                       <a:off x="0" y="0"/>
-                      <a:ext cx="5400000" cy="3180328"/>
+                      <a:ext cx="5625084" cy="3558540"/>
                     </a:xfrm>
                     <a:prstGeom prst="rect"/>
                   </pic:spPr>
@@ -20193,7 +20193,7 @@
 <w:ftr xmlns:wpc="http://schemas.microsoft.com/office/word/2010/wordprocessingCanvas" xmlns:cx="http://schemas.microsoft.com/office/drawing/2014/chartex" xmlns:cx1="http://schemas.microsoft.com/office/drawing/2015/9/8/chartex" xmlns:cx2="http://schemas.microsoft.com/office/drawing/2015/10/21/chartex" xmlns:cx3="http://schemas.microsoft.com/office/drawing/2016/5/9/chartex" xmlns:cx4="http://schemas.microsoft.com/office/drawing/2016/5/10/chartex" xmlns:cx5="http://schemas.microsoft.com/office/drawing/2016/5/11/chartex" xmlns:cx6="http://schemas.microsoft.com/office/drawing/2016/5/12/chartex" xmlns:cx7="http://schemas.microsoft.com/office/drawing/2016/5/13/chartex" xmlns:cx8="http://schemas.microsoft.com/office/drawing/2016/5/14/chartex" xmlns:mc="http://schemas.openxmlformats.org/markup-compatibility/2006" xmlns:aink="http://schemas.microsoft.com/office/drawing/2016/ink" xmlns:am3d="http://schemas.microsoft.com/office/drawing/2017/model3d" xmlns:o="urn:schemas-microsoft-com:office:office" xmlns:r="http://schemas.openxmlformats.org/officeDocument/2006/relationships" xmlns:m="http://schemas.openxmlformats.org/officeDocument/2006/math" xmlns:v="urn:schemas-microsoft-com:vml" xmlns:wp14="http://schemas.microsoft.com/office/word/2010/wordprocessingDrawing" xmlns:wp="http://schemas.openxmlformats.org/drawingml/2006/wordprocessingDrawing" xmlns:w10="urn:schemas-microsoft-com:office:word" xmlns:w="http://schemas.openxmlformats.org/wordprocessingml/2006/main" xmlns:w14="http://schemas.microsoft.com/office/word/2010/wordml" xmlns:w15="http://schemas.microsoft.com/office/word/2012/wordml" xmlns:w16cex="http://schemas.microsoft.com/office/word/2018/wordml/cex" xmlns:w16cid="http://schemas.microsoft.com/office/word/2016/wordml/cid" xmlns:w16="http://schemas.microsoft.com/office/word/2018/wordml" xmlns:w16sdtdh="http://schemas.microsoft.com/office/word/2020/wordml/sdtdatahash" xmlns:w16se="http://schemas.microsoft.com/office/word/2015/wordml/symex" xmlns:wpg="http://schemas.microsoft.com/office/word/2010/wordprocessingGroup" xmlns:wpi="http://schemas.microsoft.com/office/word/2010/wordprocessingInk" xmlns:wne="http://schemas.microsoft.com/office/word/2006/wordml" xmlns:wps="http://schemas.microsoft.com/office/word/2010/wordprocessingShape" mc:Ignorable="w14 w15 w16se w16cid w16 w16cex w16sdtdh wp14">
   <w:p>
     <w:r>
-      <w:t>`</w:t>
+      <w:t/>
     </w:r>
   </w:p>
 </w:ftr>

</xml_diff>